<commit_message>
docs: add git clone instructions and update guides
</commit_message>
<xml_diff>
--- a/STUDENT_GUIDE.docx
+++ b/STUDENT_GUIDE.docx
@@ -99,7 +99,7 @@
         <w:spacing w:before="40" w:after="40"/>
       </w:pPr>
       <w:r>
-        <w:t>3. 1단계: ROS 패키지 생성하기</w:t>
+        <w:t>3. 1단계: 패키지 준비하기 (Git Clone 또는 직접 생성)</w:t>
       </w:r>
     </w:p>
     <w:p>
@@ -391,7 +391,21 @@
           <w:color w:val="1F2328"/>
           <w:sz w:val="28"/>
         </w:rPr>
-        <w:t>3. 1단계: ROS 패키지 생성하기</w:t>
+        <w:t>3. 1단계: 패키지 준비하기 (Git Clone 또는 직접 생성)</w:t>
+      </w:r>
+    </w:p>
+    <w:p>
+      <w:pPr>
+        <w:spacing w:before="200" w:after="60"/>
+      </w:pPr>
+      <w:r>
+        <w:rPr>
+          <w:rFonts w:ascii="Malgun Gothic" w:hAnsi="Malgun Gothic"/>
+          <w:b/>
+          <w:color w:val="1F2328"/>
+          <w:sz w:val="23"/>
+        </w:rPr>
+        <w:t>방법 A. 깃허브에서 바로 다운로드하기 (Git Clone)</w:t>
       </w:r>
     </w:p>
     <w:p>
@@ -399,7 +413,79 @@
         <w:spacing w:before="40" w:after="40"/>
       </w:pPr>
       <w:r>
-        <w:t>터미널에서 catkin 워크스페이스의 src 폴더로 이동하여 패키지를 만듭니다.</w:t>
+        <w:t>이미 완성된 패키지를 내려받아 빠르게 실습하려면 워크스페이스의 src 폴더에서 클론합니다:</w:t>
+      </w:r>
+    </w:p>
+    <w:tbl>
+      <w:tblPr>
+        <w:tblW w:type="auto" w:w="0"/>
+        <w:jc w:val="center"/>
+        <w:tblLook w:firstColumn="1" w:firstRow="1" w:lastColumn="0" w:lastRow="0" w:noHBand="0" w:noVBand="1" w:val="04A0"/>
+      </w:tblPr>
+      <w:tblGrid>
+        <w:gridCol w:w="9648"/>
+      </w:tblGrid>
+      <w:tr>
+        <w:tc>
+          <w:tcPr>
+            <w:tcW w:type="dxa" w:w="9648"/>
+            <w:shd w:fill="F6F8FA"/>
+            <w:tcMar>
+              <w:top w:w="140" w:type="dxa"/>
+              <w:bottom w:w="140" w:type="dxa"/>
+              <w:left w:w="180" w:type="dxa"/>
+              <w:right w:w="180" w:type="dxa"/>
+            </w:tcMar>
+            <w:tcBorders>
+              <w:top w:val="single" w:sz="4" w:space="0" w:color="D0D7DE"/>
+              <w:left w:val="single" w:sz="4" w:space="0" w:color="D0D7DE"/>
+              <w:bottom w:val="single" w:sz="4" w:space="0" w:color="D0D7DE"/>
+              <w:right w:val="single" w:sz="4" w:space="0" w:color="D0D7DE"/>
+            </w:tcBorders>
+          </w:tcPr>
+          <w:p>
+            <w:pPr>
+              <w:spacing w:before="0" w:after="0" w:line="276" w:lineRule="auto"/>
+            </w:pPr>
+            <w:r>
+              <w:rPr>
+                <w:rFonts w:ascii="Consolas" w:hAnsi="Consolas"/>
+                <w:color w:val="1F2328"/>
+                <w:sz w:val="17"/>
+              </w:rPr>
+              <w:t>cd ~/turtle_ws/src</w:t>
+              <w:br/>
+              <w:t>git clone https://github.com/seongjun-k/srobot.git</w:t>
+            </w:r>
+          </w:p>
+        </w:tc>
+      </w:tr>
+    </w:tbl>
+    <w:p>
+      <w:pPr>
+        <w:spacing w:after="80"/>
+      </w:pPr>
+    </w:p>
+    <w:p>
+      <w:pPr>
+        <w:spacing w:before="200" w:after="60"/>
+      </w:pPr>
+      <w:r>
+        <w:rPr>
+          <w:rFonts w:ascii="Malgun Gothic" w:hAnsi="Malgun Gothic"/>
+          <w:b/>
+          <w:color w:val="1F2328"/>
+          <w:sz w:val="23"/>
+        </w:rPr>
+        <w:t>방법 B. 처음부터 내 손으로 직접 만들기</w:t>
+      </w:r>
+    </w:p>
+    <w:p>
+      <w:pPr>
+        <w:spacing w:before="40" w:after="40"/>
+      </w:pPr>
+      <w:r>
+        <w:t>패키지를 직접 하나씩 생성하며 배우고 싶다면 아래 명령어로 생성합니다:</w:t>
       </w:r>
     </w:p>
     <w:tbl>

</xml_diff>

<commit_message>
docs: match custom docx styling with table-bordered code boxes and formal numbering
</commit_message>
<xml_diff>
--- a/STUDENT_GUIDE.docx
+++ b/STUDENT_GUIDE.docx
@@ -4,312 +4,231 @@
   <w:body>
     <w:p>
       <w:pPr>
-        <w:spacing w:before="280" w:after="120"/>
-        <w:pBdr>
-          <w:bottom w:val="single" w:sz="8" w:space="4" w:color="D1D9E0"/>
-        </w:pBdr>
+        <w:spacing w:before="120" w:after="280"/>
       </w:pPr>
       <w:r>
         <w:rPr>
-          <w:rFonts w:ascii="Malgun Gothic" w:hAnsi="Malgun Gothic"/>
+          <w:rFonts w:ascii="Arial Unicode MS" w:hAnsi="Arial Unicode MS"/>
           <w:b/>
-          <w:color w:val="1F2328"/>
+          <w:color w:val="000000"/>
           <w:sz w:val="36"/>
         </w:rPr>
-        <w:t>ROS 1 로봇 원격 조종 패키지(srobot) 만들기 실습 가이드</w:t>
+        <w:t>ROS 1 Noetic 로봇 원격 조종 패키지 제작 실습</w:t>
       </w:r>
     </w:p>
     <w:p>
       <w:pPr>
-        <w:spacing w:before="40" w:after="40"/>
-        <w:ind w:left="288"/>
-        <w:pBdr>
-          <w:left w:val="single" w:sz="18" w:space="8" w:color="D0D7DE"/>
-        </w:pBdr>
+        <w:spacing w:before="280" w:after="80"/>
       </w:pPr>
       <w:r>
         <w:rPr>
-          <w:rFonts w:ascii="Malgun Gothic" w:hAnsi="Malgun Gothic"/>
-          <w:color w:val="59636E"/>
-          <w:sz w:val="19"/>
+          <w:rFonts w:ascii="Arial Unicode MS" w:hAnsi="Arial Unicode MS"/>
+          <w:b/>
+          <w:color w:val="000000"/>
+          <w:sz w:val="26"/>
         </w:rPr>
-        <w:t>수업 목표:</w:t>
+        <w:t>1. 프로젝트 개요</w:t>
       </w:r>
     </w:p>
     <w:p>
       <w:pPr>
-        <w:spacing w:before="40" w:after="40"/>
-        <w:ind w:left="288"/>
-        <w:pBdr>
-          <w:left w:val="single" w:sz="18" w:space="8" w:color="D0D7DE"/>
-        </w:pBdr>
+        <w:spacing w:before="120" w:after="40"/>
+        <w:ind w:left="216"/>
       </w:pPr>
       <w:r>
         <w:rPr>
-          <w:rFonts w:ascii="Malgun Gothic" w:hAnsi="Malgun Gothic"/>
-          <w:color w:val="59636E"/>
-          <w:sz w:val="19"/>
+          <w:rFonts w:ascii="Arial Unicode MS" w:hAnsi="Arial Unicode MS"/>
+          <w:b/>
+          <w:color w:val="000000"/>
+          <w:sz w:val="21"/>
         </w:rPr>
-        <w:t>ROS(Robot Operating System)의 기본 원리인 퍼블리셔(Publisher)와 서브스크라이버(Subscriber), 그리고 로봇 바퀴 제어용 Twist 메시지를 이해하고, 노트북 키보드로 로봇을 직접 조종하는 패키지를 완성합니다.</w:t>
+        <w:t>1) 실습 목적</w:t>
       </w:r>
     </w:p>
     <w:p>
       <w:pPr>
-        <w:spacing w:before="120" w:after="120"/>
-        <w:pBdr>
-          <w:bottom w:val="single" w:sz="6" w:space="1" w:color="D1D9E0"/>
-        </w:pBdr>
-      </w:pPr>
-    </w:p>
-    <w:p>
-      <w:pPr>
-        <w:spacing w:before="240" w:after="80"/>
-        <w:pBdr>
-          <w:bottom w:val="single" w:sz="6" w:space="3" w:color="D1D9E0"/>
-        </w:pBdr>
+        <w:spacing w:before="20" w:after="40"/>
+        <w:ind w:left="432"/>
       </w:pPr>
       <w:r>
         <w:rPr>
-          <w:rFonts w:ascii="Malgun Gothic" w:hAnsi="Malgun Gothic"/>
-          <w:b/>
-          <w:color w:val="1F2328"/>
-          <w:sz w:val="28"/>
+          <w:rFonts w:ascii="Arial Unicode MS" w:hAnsi="Arial Unicode MS"/>
+          <w:color w:val="000000"/>
+          <w:sz w:val="19"/>
         </w:rPr>
-        <w:t>목차</w:t>
+        <w:t>- ROS의 기본 통신 원리인 퍼블리셔(Publisher)와 서브스크라이버(Subscriber) 구조를 이해합니다.</w:t>
       </w:r>
     </w:p>
     <w:p>
       <w:pPr>
-        <w:spacing w:before="40" w:after="40"/>
+        <w:spacing w:before="20" w:after="40"/>
+        <w:ind w:left="432"/>
       </w:pPr>
       <w:r>
-        <w:t>1. 프로젝트 개요 및 시스템 구조</w:t>
+        <w:rPr>
+          <w:rFonts w:ascii="Arial Unicode MS" w:hAnsi="Arial Unicode MS"/>
+          <w:color w:val="000000"/>
+          <w:sz w:val="19"/>
+        </w:rPr>
+        <w:t>- 로봇 바퀴 모터 제어 표준 메시지인 geometry_msgs/Twist의 구조와 동작 방식을 이해합니다.</w:t>
       </w:r>
     </w:p>
     <w:p>
       <w:pPr>
-        <w:spacing w:before="40" w:after="40"/>
+        <w:spacing w:before="20" w:after="40"/>
+        <w:ind w:left="432"/>
       </w:pPr>
       <w:r>
-        <w:t>2. 사전 준비 (필수 패키지 설치)</w:t>
+        <w:rPr>
+          <w:rFonts w:ascii="Arial Unicode MS" w:hAnsi="Arial Unicode MS"/>
+          <w:color w:val="000000"/>
+          <w:sz w:val="19"/>
+        </w:rPr>
+        <w:t>- 노트북 키보드 입력을 통해 원격 로봇을 실시간 조종하는 srobot 패키지를 완성합니다.</w:t>
       </w:r>
     </w:p>
     <w:p>
       <w:pPr>
-        <w:spacing w:before="40" w:after="40"/>
+        <w:spacing w:before="120" w:after="40"/>
+        <w:ind w:left="216"/>
       </w:pPr>
       <w:r>
-        <w:t>3. 1단계: 패키지 준비하기 (Git Clone 또는 직접 생성)</w:t>
+        <w:rPr>
+          <w:rFonts w:ascii="Arial Unicode MS" w:hAnsi="Arial Unicode MS"/>
+          <w:b/>
+          <w:color w:val="000000"/>
+          <w:sz w:val="21"/>
+        </w:rPr>
+        <w:t>2) 시스템 통신 구조</w:t>
       </w:r>
     </w:p>
     <w:p>
       <w:pPr>
-        <w:spacing w:before="40" w:after="40"/>
+        <w:spacing w:before="20" w:after="40"/>
+        <w:ind w:left="432"/>
       </w:pPr>
       <w:r>
-        <w:t>4. 2단계: 노트북 조종 노드 작성 (teleop_key.py)</w:t>
+        <w:rPr>
+          <w:rFonts w:ascii="Arial Unicode MS" w:hAnsi="Arial Unicode MS"/>
+          <w:color w:val="000000"/>
+          <w:sz w:val="19"/>
+        </w:rPr>
+        <w:t>- 노트북 (teleop_key.py) : 키보드 입력을 감지하여 /srobot/key_cmd 토픽(String) 발행</w:t>
       </w:r>
     </w:p>
     <w:p>
       <w:pPr>
-        <w:spacing w:before="40" w:after="40"/>
+        <w:spacing w:before="20" w:after="40"/>
+        <w:ind w:left="432"/>
       </w:pPr>
       <w:r>
-        <w:t>5. 3단계: 로봇 모터 드라이버 노드 작성 (motor_driver.py)</w:t>
+        <w:rPr>
+          <w:rFonts w:ascii="Arial Unicode MS" w:hAnsi="Arial Unicode MS"/>
+          <w:color w:val="000000"/>
+          <w:sz w:val="19"/>
+        </w:rPr>
+        <w:t>- 무선 네트워크 (Wi-Fi) : 노트북과 로봇 간 ROS 멀티 마신 무선 통신 연결</w:t>
       </w:r>
     </w:p>
     <w:p>
       <w:pPr>
-        <w:spacing w:before="40" w:after="40"/>
+        <w:spacing w:before="20" w:after="40"/>
+        <w:ind w:left="432"/>
       </w:pPr>
       <w:r>
-        <w:t>6. 4단계: 런치(Launch) 파일 만들기</w:t>
+        <w:rPr>
+          <w:rFonts w:ascii="Arial Unicode MS" w:hAnsi="Arial Unicode MS"/>
+          <w:color w:val="000000"/>
+          <w:sz w:val="19"/>
+        </w:rPr>
+        <w:t>- 로봇 (motor_driver.py) : /srobot/key_cmd 토픽 수신 후 /cmd_vel 토픽(Twist) 발행</w:t>
       </w:r>
     </w:p>
     <w:p>
       <w:pPr>
-        <w:spacing w:before="40" w:after="40"/>
+        <w:spacing w:before="20" w:after="40"/>
+        <w:ind w:left="432"/>
       </w:pPr>
       <w:r>
-        <w:t>7. 5단계: 네트워크 환경 설정 (노트북과 로봇 연결)</w:t>
+        <w:rPr>
+          <w:rFonts w:ascii="Arial Unicode MS" w:hAnsi="Arial Unicode MS"/>
+          <w:color w:val="000000"/>
+          <w:sz w:val="19"/>
+        </w:rPr>
+        <w:t>- OpenCR 보드 (rosserial) : /cmd_vel 속도 지휘값을 받아 좌/우 다이나믹셀 모터 구동</w:t>
       </w:r>
     </w:p>
     <w:p>
       <w:pPr>
-        <w:spacing w:before="40" w:after="40"/>
+        <w:spacing w:before="280" w:after="80"/>
       </w:pPr>
       <w:r>
-        <w:t>8. 6단계: 로봇 조종 실습하기</w:t>
+        <w:rPr>
+          <w:rFonts w:ascii="Arial Unicode MS" w:hAnsi="Arial Unicode MS"/>
+          <w:b/>
+          <w:color w:val="000000"/>
+          <w:sz w:val="26"/>
+        </w:rPr>
+        <w:t>2. 패키지 구성 및 준비</w:t>
       </w:r>
     </w:p>
     <w:p>
       <w:pPr>
-        <w:spacing w:before="120" w:after="120"/>
-        <w:pBdr>
-          <w:bottom w:val="single" w:sz="6" w:space="1" w:color="D1D9E0"/>
-        </w:pBdr>
-      </w:pPr>
-    </w:p>
-    <w:p>
-      <w:pPr>
-        <w:spacing w:before="240" w:after="80"/>
-        <w:pBdr>
-          <w:bottom w:val="single" w:sz="6" w:space="3" w:color="D1D9E0"/>
-        </w:pBdr>
+        <w:spacing w:before="120" w:after="40"/>
+        <w:ind w:left="216"/>
       </w:pPr>
       <w:r>
         <w:rPr>
-          <w:rFonts w:ascii="Malgun Gothic" w:hAnsi="Malgun Gothic"/>
+          <w:rFonts w:ascii="Arial Unicode MS" w:hAnsi="Arial Unicode MS"/>
           <w:b/>
-          <w:color w:val="1F2328"/>
-          <w:sz w:val="28"/>
+          <w:color w:val="000000"/>
+          <w:sz w:val="21"/>
         </w:rPr>
-        <w:t>1. 프로젝트 개요 및 시스템 구조</w:t>
+        <w:t>1) 패키지 이름 : srobot</w:t>
       </w:r>
     </w:p>
     <w:p>
       <w:pPr>
-        <w:spacing w:before="200" w:after="60"/>
+        <w:spacing w:before="120" w:after="40"/>
+        <w:ind w:left="216"/>
       </w:pPr>
       <w:r>
         <w:rPr>
-          <w:rFonts w:ascii="Malgun Gothic" w:hAnsi="Malgun Gothic"/>
+          <w:rFonts w:ascii="Arial Unicode MS" w:hAnsi="Arial Unicode MS"/>
           <w:b/>
-          <w:color w:val="1F2328"/>
-          <w:sz w:val="23"/>
+          <w:color w:val="000000"/>
+          <w:sz w:val="21"/>
         </w:rPr>
-        <w:t>1.1 이번 시간에 무엇을 만드나요?</w:t>
+        <w:t>2) 의존성 패키지 : rospy, std_msgs, geometry_msgs, rosserial_python</w:t>
       </w:r>
     </w:p>
     <w:p>
       <w:pPr>
-        <w:pStyle w:val="ListBullet"/>
-        <w:spacing w:before="20" w:after="20"/>
+        <w:spacing w:before="120" w:after="40"/>
+        <w:ind w:left="216"/>
       </w:pPr>
       <w:r>
-        <w:t>노트북에서 w, a, s, d, x 키를 누르면</w:t>
+        <w:rPr>
+          <w:rFonts w:ascii="Arial Unicode MS" w:hAnsi="Arial Unicode MS"/>
+          <w:b/>
+          <w:color w:val="000000"/>
+          <w:sz w:val="21"/>
+        </w:rPr>
+        <w:t>3) 로봇 측 필수 패키지 설치 및 권한 설정</w:t>
       </w:r>
     </w:p>
     <w:p>
       <w:pPr>
-        <w:pStyle w:val="ListBullet"/>
-        <w:spacing w:before="20" w:after="20"/>
-      </w:pPr>
-      <w:r>
-        <w:t>Wi-Fi 무선 통신을 통해 로봇에 명령이 전달되어</w:t>
-      </w:r>
-    </w:p>
-    <w:p>
-      <w:pPr>
-        <w:pStyle w:val="ListBullet"/>
-        <w:spacing w:before="20" w:after="20"/>
-      </w:pPr>
-      <w:r>
-        <w:t>로봇 바퀴 모터가 회전하여 로봇이 움직입니다.</w:t>
-      </w:r>
-    </w:p>
-    <w:p>
-      <w:pPr>
-        <w:spacing w:before="200" w:after="60"/>
+        <w:spacing w:before="20" w:after="40"/>
+        <w:ind w:left="432"/>
       </w:pPr>
       <w:r>
         <w:rPr>
-          <w:rFonts w:ascii="Malgun Gothic" w:hAnsi="Malgun Gothic"/>
-          <w:b/>
-          <w:color w:val="1F2328"/>
-          <w:sz w:val="23"/>
+          <w:rFonts w:ascii="Arial Unicode MS" w:hAnsi="Arial Unicode MS"/>
+          <w:color w:val="000000"/>
+          <w:sz w:val="19"/>
         </w:rPr>
-        <w:t>1.2 시스템 통신 구조</w:t>
-      </w:r>
-    </w:p>
-    <w:p>
-      <w:pPr>
-        <w:pStyle w:val="ListBullet"/>
-        <w:spacing w:before="20" w:after="20"/>
-      </w:pPr>
-      <w:r>
-        <w:t>노트북 (teleop_key.py)</w:t>
-      </w:r>
-    </w:p>
-    <w:p>
-      <w:pPr>
-        <w:spacing w:before="40" w:after="40"/>
-      </w:pPr>
-      <w:r>
-        <w:t xml:space="preserve">  -&gt; /srobot/key_cmd 토픽 발행 (String 메시지)</w:t>
-      </w:r>
-    </w:p>
-    <w:p>
-      <w:pPr>
-        <w:spacing w:before="40" w:after="40"/>
-      </w:pPr>
-      <w:r>
-        <w:t xml:space="preserve">  -&gt; Wi-Fi 네트워크</w:t>
-      </w:r>
-    </w:p>
-    <w:p>
-      <w:pPr>
-        <w:spacing w:before="40" w:after="40"/>
-      </w:pPr>
-      <w:r>
-        <w:t xml:space="preserve">  -&gt; 로봇 (motor_driver.py)</w:t>
-      </w:r>
-    </w:p>
-    <w:p>
-      <w:pPr>
-        <w:spacing w:before="40" w:after="40"/>
-      </w:pPr>
-      <w:r>
-        <w:t xml:space="preserve">  -&gt; /cmd_vel 토픽 발행 (Twist 메시지)</w:t>
-      </w:r>
-    </w:p>
-    <w:p>
-      <w:pPr>
-        <w:spacing w:before="40" w:after="40"/>
-      </w:pPr>
-      <w:r>
-        <w:t xml:space="preserve">  -&gt; OpenCR 보드 (rosserial)</w:t>
-      </w:r>
-    </w:p>
-    <w:p>
-      <w:pPr>
-        <w:spacing w:before="40" w:after="40"/>
-      </w:pPr>
-      <w:r>
-        <w:t xml:space="preserve">  -&gt; 바퀴 모터 구동</w:t>
-      </w:r>
-    </w:p>
-    <w:p>
-      <w:pPr>
-        <w:spacing w:before="120" w:after="120"/>
-        <w:pBdr>
-          <w:bottom w:val="single" w:sz="6" w:space="1" w:color="D1D9E0"/>
-        </w:pBdr>
-      </w:pPr>
-    </w:p>
-    <w:p>
-      <w:pPr>
-        <w:spacing w:before="240" w:after="80"/>
-        <w:pBdr>
-          <w:bottom w:val="single" w:sz="6" w:space="3" w:color="D1D9E0"/>
-        </w:pBdr>
-      </w:pPr>
-      <w:r>
-        <w:rPr>
-          <w:rFonts w:ascii="Malgun Gothic" w:hAnsi="Malgun Gothic"/>
-          <w:b/>
-          <w:color w:val="1F2328"/>
-          <w:sz w:val="28"/>
-        </w:rPr>
-        <w:t>2. 사전 준비 (필수 패키지 설치)</w:t>
-      </w:r>
-    </w:p>
-    <w:p>
-      <w:pPr>
-        <w:spacing w:before="40" w:after="40"/>
-      </w:pPr>
-      <w:r>
-        <w:t>로봇(라즈베리파이)에서 OpenCR 보드와 통신하기 위해 설치합니다.</w:t>
+        <w:t>로봇(라즈베리파이) 터미널에서 OpenCR 시리얼 통신 패키지를 설치하고 권한을 부여합니다:</w:t>
       </w:r>
     </w:p>
     <w:tbl>
@@ -319,25 +238,24 @@
         <w:tblLook w:firstColumn="1" w:firstRow="1" w:lastColumn="0" w:lastRow="0" w:noHBand="0" w:noVBand="1" w:val="04A0"/>
       </w:tblPr>
       <w:tblGrid>
-        <w:gridCol w:w="9648"/>
+        <w:gridCol w:w="9317"/>
       </w:tblGrid>
       <w:tr>
         <w:tc>
           <w:tcPr>
-            <w:tcW w:type="dxa" w:w="9648"/>
-            <w:shd w:fill="F6F8FA"/>
+            <w:tcW w:type="dxa" w:w="9072"/>
+            <w:tcBorders>
+              <w:top w:val="single" w:sz="8" w:space="0" w:color="000000"/>
+              <w:left w:val="single" w:sz="8" w:space="0" w:color="000000"/>
+              <w:bottom w:val="single" w:sz="8" w:space="0" w:color="000000"/>
+              <w:right w:val="single" w:sz="8" w:space="0" w:color="000000"/>
+            </w:tcBorders>
             <w:tcMar>
-              <w:top w:w="140" w:type="dxa"/>
-              <w:bottom w:w="140" w:type="dxa"/>
-              <w:left w:w="180" w:type="dxa"/>
-              <w:right w:w="180" w:type="dxa"/>
+              <w:top w:w="120" w:type="dxa"/>
+              <w:bottom w:w="120" w:type="dxa"/>
+              <w:left w:w="160" w:type="dxa"/>
+              <w:right w:w="160" w:type="dxa"/>
             </w:tcMar>
-            <w:tcBorders>
-              <w:top w:val="single" w:sz="4" w:space="0" w:color="D0D7DE"/>
-              <w:left w:val="single" w:sz="4" w:space="0" w:color="D0D7DE"/>
-              <w:bottom w:val="single" w:sz="4" w:space="0" w:color="D0D7DE"/>
-              <w:right w:val="single" w:sz="4" w:space="0" w:color="D0D7DE"/>
-            </w:tcBorders>
           </w:tcPr>
           <w:p>
             <w:pPr>
@@ -346,17 +264,12 @@
             <w:r>
               <w:rPr>
                 <w:rFonts w:ascii="Consolas" w:hAnsi="Consolas"/>
-                <w:color w:val="1F2328"/>
+                <w:color w:val="000000"/>
                 <w:sz w:val="17"/>
               </w:rPr>
-              <w:t># 로봇 터미널에서 실행</w:t>
-              <w:br/>
               <w:t>sudo apt update</w:t>
               <w:br/>
               <w:t>sudo apt install -y ros-noetic-rosserial-python ros-noetic-rosserial-msgs</w:t>
-              <w:br/>
-              <w:br/>
-              <w:t># 시리얼 포트 접근 권한 설정</w:t>
               <w:br/>
               <w:t>sudo usermod -aG dialout $USER</w:t>
             </w:r>
@@ -366,54 +279,36 @@
     </w:tbl>
     <w:p>
       <w:pPr>
-        <w:spacing w:after="80"/>
+        <w:spacing w:before="0" w:after="80"/>
       </w:pPr>
     </w:p>
     <w:p>
       <w:pPr>
-        <w:spacing w:before="120" w:after="120"/>
-        <w:pBdr>
-          <w:bottom w:val="single" w:sz="6" w:space="1" w:color="D1D9E0"/>
-        </w:pBdr>
-      </w:pPr>
-    </w:p>
-    <w:p>
-      <w:pPr>
-        <w:spacing w:before="240" w:after="80"/>
-        <w:pBdr>
-          <w:bottom w:val="single" w:sz="6" w:space="3" w:color="D1D9E0"/>
-        </w:pBdr>
+        <w:spacing w:before="120" w:after="40"/>
+        <w:ind w:left="216"/>
       </w:pPr>
       <w:r>
         <w:rPr>
-          <w:rFonts w:ascii="Malgun Gothic" w:hAnsi="Malgun Gothic"/>
+          <w:rFonts w:ascii="Arial Unicode MS" w:hAnsi="Arial Unicode MS"/>
           <w:b/>
-          <w:color w:val="1F2328"/>
-          <w:sz w:val="28"/>
+          <w:color w:val="000000"/>
+          <w:sz w:val="21"/>
         </w:rPr>
-        <w:t>3. 1단계: 패키지 준비하기 (Git Clone 또는 직접 생성)</w:t>
+        <w:t>4) 깃허브에서 패키지 다운로드 (Git Clone)</w:t>
       </w:r>
     </w:p>
     <w:p>
       <w:pPr>
-        <w:spacing w:before="200" w:after="60"/>
+        <w:spacing w:before="20" w:after="40"/>
+        <w:ind w:left="432"/>
       </w:pPr>
       <w:r>
         <w:rPr>
-          <w:rFonts w:ascii="Malgun Gothic" w:hAnsi="Malgun Gothic"/>
-          <w:b/>
-          <w:color w:val="1F2328"/>
-          <w:sz w:val="23"/>
+          <w:rFonts w:ascii="Arial Unicode MS" w:hAnsi="Arial Unicode MS"/>
+          <w:color w:val="000000"/>
+          <w:sz w:val="19"/>
         </w:rPr>
-        <w:t>방법 A. 깃허브에서 바로 다운로드하기 (Git Clone)</w:t>
-      </w:r>
-    </w:p>
-    <w:p>
-      <w:pPr>
-        <w:spacing w:before="40" w:after="40"/>
-      </w:pPr>
-      <w:r>
-        <w:t>이미 완성된 패키지를 내려받아 빠르게 실습하려면 워크스페이스의 src 폴더에서 클론합니다:</w:t>
+        <w:t>이미 완성된 패키지를 깃허브에서 내려받아 바로 실습할 경우 워크스페이스에서 실행합니다:</w:t>
       </w:r>
     </w:p>
     <w:tbl>
@@ -423,25 +318,24 @@
         <w:tblLook w:firstColumn="1" w:firstRow="1" w:lastColumn="0" w:lastRow="0" w:noHBand="0" w:noVBand="1" w:val="04A0"/>
       </w:tblPr>
       <w:tblGrid>
-        <w:gridCol w:w="9648"/>
+        <w:gridCol w:w="9317"/>
       </w:tblGrid>
       <w:tr>
         <w:tc>
           <w:tcPr>
-            <w:tcW w:type="dxa" w:w="9648"/>
-            <w:shd w:fill="F6F8FA"/>
+            <w:tcW w:type="dxa" w:w="9072"/>
+            <w:tcBorders>
+              <w:top w:val="single" w:sz="8" w:space="0" w:color="000000"/>
+              <w:left w:val="single" w:sz="8" w:space="0" w:color="000000"/>
+              <w:bottom w:val="single" w:sz="8" w:space="0" w:color="000000"/>
+              <w:right w:val="single" w:sz="8" w:space="0" w:color="000000"/>
+            </w:tcBorders>
             <w:tcMar>
-              <w:top w:w="140" w:type="dxa"/>
-              <w:bottom w:w="140" w:type="dxa"/>
-              <w:left w:w="180" w:type="dxa"/>
-              <w:right w:w="180" w:type="dxa"/>
+              <w:top w:w="120" w:type="dxa"/>
+              <w:bottom w:w="120" w:type="dxa"/>
+              <w:left w:w="160" w:type="dxa"/>
+              <w:right w:w="160" w:type="dxa"/>
             </w:tcMar>
-            <w:tcBorders>
-              <w:top w:val="single" w:sz="4" w:space="0" w:color="D0D7DE"/>
-              <w:left w:val="single" w:sz="4" w:space="0" w:color="D0D7DE"/>
-              <w:bottom w:val="single" w:sz="4" w:space="0" w:color="D0D7DE"/>
-              <w:right w:val="single" w:sz="4" w:space="0" w:color="D0D7DE"/>
-            </w:tcBorders>
           </w:tcPr>
           <w:p>
             <w:pPr>
@@ -450,7 +344,7 @@
             <w:r>
               <w:rPr>
                 <w:rFonts w:ascii="Consolas" w:hAnsi="Consolas"/>
-                <w:color w:val="1F2328"/>
+                <w:color w:val="000000"/>
                 <w:sz w:val="17"/>
               </w:rPr>
               <w:t>cd ~/turtle_ws/src</w:t>
@@ -463,29 +357,36 @@
     </w:tbl>
     <w:p>
       <w:pPr>
-        <w:spacing w:after="80"/>
+        <w:spacing w:before="0" w:after="80"/>
       </w:pPr>
     </w:p>
     <w:p>
       <w:pPr>
-        <w:spacing w:before="200" w:after="60"/>
+        <w:spacing w:before="120" w:after="40"/>
+        <w:ind w:left="216"/>
       </w:pPr>
       <w:r>
         <w:rPr>
-          <w:rFonts w:ascii="Malgun Gothic" w:hAnsi="Malgun Gothic"/>
+          <w:rFonts w:ascii="Arial Unicode MS" w:hAnsi="Arial Unicode MS"/>
           <w:b/>
-          <w:color w:val="1F2328"/>
-          <w:sz w:val="23"/>
+          <w:color w:val="000000"/>
+          <w:sz w:val="21"/>
         </w:rPr>
-        <w:t>방법 B. 처음부터 내 손으로 직접 만들기</w:t>
+        <w:t>5) 직접 패키지 생성하기 (처음부터 직접 만들 경우)</w:t>
       </w:r>
     </w:p>
     <w:p>
       <w:pPr>
-        <w:spacing w:before="40" w:after="40"/>
+        <w:spacing w:before="20" w:after="40"/>
+        <w:ind w:left="432"/>
       </w:pPr>
       <w:r>
-        <w:t>패키지를 직접 하나씩 생성하며 배우고 싶다면 아래 명령어로 생성합니다:</w:t>
+        <w:rPr>
+          <w:rFonts w:ascii="Arial Unicode MS" w:hAnsi="Arial Unicode MS"/>
+          <w:color w:val="000000"/>
+          <w:sz w:val="19"/>
+        </w:rPr>
+        <w:t>패키지를 기초부터 직접 만들어볼 경우 아래 명령어로 패키지와 폴더를 생성합니다:</w:t>
       </w:r>
     </w:p>
     <w:tbl>
@@ -495,25 +396,24 @@
         <w:tblLook w:firstColumn="1" w:firstRow="1" w:lastColumn="0" w:lastRow="0" w:noHBand="0" w:noVBand="1" w:val="04A0"/>
       </w:tblPr>
       <w:tblGrid>
-        <w:gridCol w:w="9648"/>
+        <w:gridCol w:w="9317"/>
       </w:tblGrid>
       <w:tr>
         <w:tc>
           <w:tcPr>
-            <w:tcW w:type="dxa" w:w="9648"/>
-            <w:shd w:fill="F6F8FA"/>
+            <w:tcW w:type="dxa" w:w="9072"/>
+            <w:tcBorders>
+              <w:top w:val="single" w:sz="8" w:space="0" w:color="000000"/>
+              <w:left w:val="single" w:sz="8" w:space="0" w:color="000000"/>
+              <w:bottom w:val="single" w:sz="8" w:space="0" w:color="000000"/>
+              <w:right w:val="single" w:sz="8" w:space="0" w:color="000000"/>
+            </w:tcBorders>
             <w:tcMar>
-              <w:top w:w="140" w:type="dxa"/>
-              <w:bottom w:w="140" w:type="dxa"/>
-              <w:left w:w="180" w:type="dxa"/>
-              <w:right w:w="180" w:type="dxa"/>
+              <w:top w:w="120" w:type="dxa"/>
+              <w:bottom w:w="120" w:type="dxa"/>
+              <w:left w:w="160" w:type="dxa"/>
+              <w:right w:w="160" w:type="dxa"/>
             </w:tcMar>
-            <w:tcBorders>
-              <w:top w:val="single" w:sz="4" w:space="0" w:color="D0D7DE"/>
-              <w:left w:val="single" w:sz="4" w:space="0" w:color="D0D7DE"/>
-              <w:bottom w:val="single" w:sz="4" w:space="0" w:color="D0D7DE"/>
-              <w:right w:val="single" w:sz="4" w:space="0" w:color="D0D7DE"/>
-            </w:tcBorders>
           </w:tcPr>
           <w:p>
             <w:pPr>
@@ -522,7 +422,7 @@
             <w:r>
               <w:rPr>
                 <w:rFonts w:ascii="Consolas" w:hAnsi="Consolas"/>
-                <w:color w:val="1F2328"/>
+                <w:color w:val="000000"/>
                 <w:sz w:val="17"/>
               </w:rPr>
               <w:t>cd ~/turtle_ws/src</w:t>
@@ -539,48 +439,65 @@
     </w:tbl>
     <w:p>
       <w:pPr>
-        <w:spacing w:after="80"/>
+        <w:spacing w:before="0" w:after="80"/>
       </w:pPr>
     </w:p>
     <w:p>
       <w:pPr>
-        <w:spacing w:before="120" w:after="120"/>
-        <w:pBdr>
-          <w:bottom w:val="single" w:sz="6" w:space="1" w:color="D1D9E0"/>
-        </w:pBdr>
-      </w:pPr>
-    </w:p>
-    <w:p>
-      <w:pPr>
-        <w:spacing w:before="240" w:after="80"/>
-        <w:pBdr>
-          <w:bottom w:val="single" w:sz="6" w:space="3" w:color="D1D9E0"/>
-        </w:pBdr>
+        <w:spacing w:before="280" w:after="80"/>
       </w:pPr>
       <w:r>
         <w:rPr>
-          <w:rFonts w:ascii="Malgun Gothic" w:hAnsi="Malgun Gothic"/>
+          <w:rFonts w:ascii="Arial Unicode MS" w:hAnsi="Arial Unicode MS"/>
           <w:b/>
-          <w:color w:val="1F2328"/>
-          <w:sz w:val="28"/>
+          <w:color w:val="000000"/>
+          <w:sz w:val="26"/>
         </w:rPr>
-        <w:t>4. 2단계: 노트북 조종 노드 작성 (scripts/teleop_key.py)</w:t>
+        <w:t>3. 노트북 조종 노드 작성 (teleop_key.py)</w:t>
       </w:r>
     </w:p>
     <w:p>
       <w:pPr>
-        <w:spacing w:before="40" w:after="40"/>
+        <w:spacing w:before="120" w:after="40"/>
+        <w:ind w:left="216"/>
       </w:pPr>
       <w:r>
-        <w:t>노트북에서 실행할 키보드 입력 프로그램입니다.</w:t>
+        <w:rPr>
+          <w:rFonts w:ascii="Arial Unicode MS" w:hAnsi="Arial Unicode MS"/>
+          <w:b/>
+          <w:color w:val="000000"/>
+          <w:sz w:val="21"/>
+        </w:rPr>
+        <w:t>1) 소스 파일 경로 : scripts/teleop_key.py</w:t>
       </w:r>
     </w:p>
     <w:p>
       <w:pPr>
-        <w:spacing w:before="40" w:after="40"/>
+        <w:spacing w:before="120" w:after="40"/>
+        <w:ind w:left="216"/>
       </w:pPr>
       <w:r>
-        <w:t>아래 코드를 직접 입력하여 저장합니다.</w:t>
+        <w:rPr>
+          <w:rFonts w:ascii="Arial Unicode MS" w:hAnsi="Arial Unicode MS"/>
+          <w:b/>
+          <w:color w:val="000000"/>
+          <w:sz w:val="21"/>
+        </w:rPr>
+        <w:t>2) 소스 코드 작성</w:t>
+      </w:r>
+    </w:p>
+    <w:p>
+      <w:pPr>
+        <w:spacing w:before="20" w:after="40"/>
+        <w:ind w:left="432"/>
+      </w:pPr>
+      <w:r>
+        <w:rPr>
+          <w:rFonts w:ascii="Arial Unicode MS" w:hAnsi="Arial Unicode MS"/>
+          <w:color w:val="000000"/>
+          <w:sz w:val="19"/>
+        </w:rPr>
+        <w:t>노트북에서 엔터(Enter) 없이 키보드 입력을 즉시 감지하여 로봇으로 전송하는 노드입니다:</w:t>
       </w:r>
     </w:p>
     <w:tbl>
@@ -590,25 +507,24 @@
         <w:tblLook w:firstColumn="1" w:firstRow="1" w:lastColumn="0" w:lastRow="0" w:noHBand="0" w:noVBand="1" w:val="04A0"/>
       </w:tblPr>
       <w:tblGrid>
-        <w:gridCol w:w="9648"/>
+        <w:gridCol w:w="9317"/>
       </w:tblGrid>
       <w:tr>
         <w:tc>
           <w:tcPr>
-            <w:tcW w:type="dxa" w:w="9648"/>
-            <w:shd w:fill="F6F8FA"/>
+            <w:tcW w:type="dxa" w:w="9072"/>
+            <w:tcBorders>
+              <w:top w:val="single" w:sz="8" w:space="0" w:color="000000"/>
+              <w:left w:val="single" w:sz="8" w:space="0" w:color="000000"/>
+              <w:bottom w:val="single" w:sz="8" w:space="0" w:color="000000"/>
+              <w:right w:val="single" w:sz="8" w:space="0" w:color="000000"/>
+            </w:tcBorders>
             <w:tcMar>
-              <w:top w:w="140" w:type="dxa"/>
-              <w:bottom w:w="140" w:type="dxa"/>
-              <w:left w:w="180" w:type="dxa"/>
-              <w:right w:w="180" w:type="dxa"/>
+              <w:top w:w="120" w:type="dxa"/>
+              <w:bottom w:w="120" w:type="dxa"/>
+              <w:left w:w="160" w:type="dxa"/>
+              <w:right w:w="160" w:type="dxa"/>
             </w:tcMar>
-            <w:tcBorders>
-              <w:top w:val="single" w:sz="4" w:space="0" w:color="D0D7DE"/>
-              <w:left w:val="single" w:sz="4" w:space="0" w:color="D0D7DE"/>
-              <w:bottom w:val="single" w:sz="4" w:space="0" w:color="D0D7DE"/>
-              <w:right w:val="single" w:sz="4" w:space="0" w:color="D0D7DE"/>
-            </w:tcBorders>
           </w:tcPr>
           <w:p>
             <w:pPr>
@@ -617,69 +533,7 @@
             <w:r>
               <w:rPr>
                 <w:rFonts w:ascii="Consolas" w:hAnsi="Consolas"/>
-                <w:color w:val="1F2328"/>
-                <w:sz w:val="17"/>
-              </w:rPr>
-              <w:t>nano scripts/teleop_key.py</w:t>
-            </w:r>
-          </w:p>
-        </w:tc>
-      </w:tr>
-    </w:tbl>
-    <w:p>
-      <w:pPr>
-        <w:spacing w:after="80"/>
-      </w:pPr>
-    </w:p>
-    <w:p>
-      <w:pPr>
-        <w:spacing w:before="200" w:after="60"/>
-      </w:pPr>
-      <w:r>
-        <w:rPr>
-          <w:rFonts w:ascii="Malgun Gothic" w:hAnsi="Malgun Gothic"/>
-          <w:b/>
-          <w:color w:val="1F2328"/>
-          <w:sz w:val="23"/>
-        </w:rPr>
-        <w:t>소스 코드 (teleop_key.py)</w:t>
-      </w:r>
-    </w:p>
-    <w:tbl>
-      <w:tblPr>
-        <w:tblW w:type="auto" w:w="0"/>
-        <w:jc w:val="center"/>
-        <w:tblLook w:firstColumn="1" w:firstRow="1" w:lastColumn="0" w:lastRow="0" w:noHBand="0" w:noVBand="1" w:val="04A0"/>
-      </w:tblPr>
-      <w:tblGrid>
-        <w:gridCol w:w="9648"/>
-      </w:tblGrid>
-      <w:tr>
-        <w:tc>
-          <w:tcPr>
-            <w:tcW w:type="dxa" w:w="9648"/>
-            <w:shd w:fill="F6F8FA"/>
-            <w:tcMar>
-              <w:top w:w="140" w:type="dxa"/>
-              <w:bottom w:w="140" w:type="dxa"/>
-              <w:left w:w="180" w:type="dxa"/>
-              <w:right w:w="180" w:type="dxa"/>
-            </w:tcMar>
-            <w:tcBorders>
-              <w:top w:val="single" w:sz="4" w:space="0" w:color="D0D7DE"/>
-              <w:left w:val="single" w:sz="4" w:space="0" w:color="D0D7DE"/>
-              <w:bottom w:val="single" w:sz="4" w:space="0" w:color="D0D7DE"/>
-              <w:right w:val="single" w:sz="4" w:space="0" w:color="D0D7DE"/>
-            </w:tcBorders>
-          </w:tcPr>
-          <w:p>
-            <w:pPr>
-              <w:spacing w:before="0" w:after="0" w:line="276" w:lineRule="auto"/>
-            </w:pPr>
-            <w:r>
-              <w:rPr>
-                <w:rFonts w:ascii="Consolas" w:hAnsi="Consolas"/>
-                <w:color w:val="1F2328"/>
+                <w:color w:val="000000"/>
                 <w:sz w:val="17"/>
               </w:rPr>
               <w:t>#!/usr/bin/env python3</w:t>
@@ -788,21 +642,36 @@
     </w:tbl>
     <w:p>
       <w:pPr>
-        <w:spacing w:after="80"/>
+        <w:spacing w:before="0" w:after="80"/>
       </w:pPr>
     </w:p>
     <w:p>
       <w:pPr>
-        <w:spacing w:before="200" w:after="60"/>
+        <w:spacing w:before="120" w:after="40"/>
+        <w:ind w:left="216"/>
       </w:pPr>
       <w:r>
         <w:rPr>
-          <w:rFonts w:ascii="Malgun Gothic" w:hAnsi="Malgun Gothic"/>
+          <w:rFonts w:ascii="Arial Unicode MS" w:hAnsi="Arial Unicode MS"/>
           <w:b/>
-          <w:color w:val="1F2328"/>
-          <w:sz w:val="23"/>
+          <w:color w:val="000000"/>
+          <w:sz w:val="21"/>
         </w:rPr>
-        <w:t>실행 권한 부여 (필수)</w:t>
+        <w:t>3) 실행 권한 부여 (필수)</w:t>
+      </w:r>
+    </w:p>
+    <w:p>
+      <w:pPr>
+        <w:spacing w:before="20" w:after="40"/>
+        <w:ind w:left="432"/>
+      </w:pPr>
+      <w:r>
+        <w:rPr>
+          <w:rFonts w:ascii="Arial Unicode MS" w:hAnsi="Arial Unicode MS"/>
+          <w:color w:val="000000"/>
+          <w:sz w:val="19"/>
+        </w:rPr>
+        <w:t>작성한 파이썬 스크립트에 실행 권한(+x)을 부여합니다:</w:t>
       </w:r>
     </w:p>
     <w:tbl>
@@ -812,25 +681,24 @@
         <w:tblLook w:firstColumn="1" w:firstRow="1" w:lastColumn="0" w:lastRow="0" w:noHBand="0" w:noVBand="1" w:val="04A0"/>
       </w:tblPr>
       <w:tblGrid>
-        <w:gridCol w:w="9648"/>
+        <w:gridCol w:w="9317"/>
       </w:tblGrid>
       <w:tr>
         <w:tc>
           <w:tcPr>
-            <w:tcW w:type="dxa" w:w="9648"/>
-            <w:shd w:fill="F6F8FA"/>
+            <w:tcW w:type="dxa" w:w="9072"/>
+            <w:tcBorders>
+              <w:top w:val="single" w:sz="8" w:space="0" w:color="000000"/>
+              <w:left w:val="single" w:sz="8" w:space="0" w:color="000000"/>
+              <w:bottom w:val="single" w:sz="8" w:space="0" w:color="000000"/>
+              <w:right w:val="single" w:sz="8" w:space="0" w:color="000000"/>
+            </w:tcBorders>
             <w:tcMar>
-              <w:top w:w="140" w:type="dxa"/>
-              <w:bottom w:w="140" w:type="dxa"/>
-              <w:left w:w="180" w:type="dxa"/>
-              <w:right w:w="180" w:type="dxa"/>
+              <w:top w:w="120" w:type="dxa"/>
+              <w:bottom w:w="120" w:type="dxa"/>
+              <w:left w:w="160" w:type="dxa"/>
+              <w:right w:w="160" w:type="dxa"/>
             </w:tcMar>
-            <w:tcBorders>
-              <w:top w:val="single" w:sz="4" w:space="0" w:color="D0D7DE"/>
-              <w:left w:val="single" w:sz="4" w:space="0" w:color="D0D7DE"/>
-              <w:bottom w:val="single" w:sz="4" w:space="0" w:color="D0D7DE"/>
-              <w:right w:val="single" w:sz="4" w:space="0" w:color="D0D7DE"/>
-            </w:tcBorders>
           </w:tcPr>
           <w:p>
             <w:pPr>
@@ -839,7 +707,7 @@
             <w:r>
               <w:rPr>
                 <w:rFonts w:ascii="Consolas" w:hAnsi="Consolas"/>
-                <w:color w:val="1F2328"/>
+                <w:color w:val="000000"/>
                 <w:sz w:val="17"/>
               </w:rPr>
               <w:t>chmod +x scripts/teleop_key.py</w:t>
@@ -850,40 +718,65 @@
     </w:tbl>
     <w:p>
       <w:pPr>
-        <w:spacing w:after="80"/>
+        <w:spacing w:before="0" w:after="80"/>
       </w:pPr>
     </w:p>
     <w:p>
       <w:pPr>
-        <w:spacing w:before="120" w:after="120"/>
-        <w:pBdr>
-          <w:bottom w:val="single" w:sz="6" w:space="1" w:color="D1D9E0"/>
-        </w:pBdr>
-      </w:pPr>
-    </w:p>
-    <w:p>
-      <w:pPr>
-        <w:spacing w:before="240" w:after="80"/>
-        <w:pBdr>
-          <w:bottom w:val="single" w:sz="6" w:space="3" w:color="D1D9E0"/>
-        </w:pBdr>
+        <w:spacing w:before="280" w:after="80"/>
       </w:pPr>
       <w:r>
         <w:rPr>
-          <w:rFonts w:ascii="Malgun Gothic" w:hAnsi="Malgun Gothic"/>
+          <w:rFonts w:ascii="Arial Unicode MS" w:hAnsi="Arial Unicode MS"/>
           <w:b/>
-          <w:color w:val="1F2328"/>
-          <w:sz w:val="28"/>
+          <w:color w:val="000000"/>
+          <w:sz w:val="26"/>
         </w:rPr>
-        <w:t>5. 3단계: 로봇 모터 드라이버 노드 작성 (scripts/motor_driver.py)</w:t>
+        <w:t>4. 로봇 모터 드라이버 노드 작성 (motor_driver.py)</w:t>
       </w:r>
     </w:p>
     <w:p>
       <w:pPr>
-        <w:spacing w:before="40" w:after="40"/>
+        <w:spacing w:before="120" w:after="40"/>
+        <w:ind w:left="216"/>
       </w:pPr>
       <w:r>
-        <w:t>로봇에서 키 입력을 받아 실제 모터 속도(Twist)로 변환하는 노드입니다.</w:t>
+        <w:rPr>
+          <w:rFonts w:ascii="Arial Unicode MS" w:hAnsi="Arial Unicode MS"/>
+          <w:b/>
+          <w:color w:val="000000"/>
+          <w:sz w:val="21"/>
+        </w:rPr>
+        <w:t>1) 소스 파일 경로 : scripts/motor_driver.py</w:t>
+      </w:r>
+    </w:p>
+    <w:p>
+      <w:pPr>
+        <w:spacing w:before="120" w:after="40"/>
+        <w:ind w:left="216"/>
+      </w:pPr>
+      <w:r>
+        <w:rPr>
+          <w:rFonts w:ascii="Arial Unicode MS" w:hAnsi="Arial Unicode MS"/>
+          <w:b/>
+          <w:color w:val="000000"/>
+          <w:sz w:val="21"/>
+        </w:rPr>
+        <w:t>2) 소스 코드 작성</w:t>
+      </w:r>
+    </w:p>
+    <w:p>
+      <w:pPr>
+        <w:spacing w:before="20" w:after="40"/>
+        <w:ind w:left="432"/>
+      </w:pPr>
+      <w:r>
+        <w:rPr>
+          <w:rFonts w:ascii="Arial Unicode MS" w:hAnsi="Arial Unicode MS"/>
+          <w:color w:val="000000"/>
+          <w:sz w:val="19"/>
+        </w:rPr>
+        <w:t>키 입력을 수신하여 다이나믹셀 모터 구동용 Twist 속도로 변환해 /cmd_vel로 발행하는 노드입니다:</w:t>
       </w:r>
     </w:p>
     <w:tbl>
@@ -893,25 +786,24 @@
         <w:tblLook w:firstColumn="1" w:firstRow="1" w:lastColumn="0" w:lastRow="0" w:noHBand="0" w:noVBand="1" w:val="04A0"/>
       </w:tblPr>
       <w:tblGrid>
-        <w:gridCol w:w="9648"/>
+        <w:gridCol w:w="9317"/>
       </w:tblGrid>
       <w:tr>
         <w:tc>
           <w:tcPr>
-            <w:tcW w:type="dxa" w:w="9648"/>
-            <w:shd w:fill="F6F8FA"/>
+            <w:tcW w:type="dxa" w:w="9072"/>
+            <w:tcBorders>
+              <w:top w:val="single" w:sz="8" w:space="0" w:color="000000"/>
+              <w:left w:val="single" w:sz="8" w:space="0" w:color="000000"/>
+              <w:bottom w:val="single" w:sz="8" w:space="0" w:color="000000"/>
+              <w:right w:val="single" w:sz="8" w:space="0" w:color="000000"/>
+            </w:tcBorders>
             <w:tcMar>
-              <w:top w:w="140" w:type="dxa"/>
-              <w:bottom w:w="140" w:type="dxa"/>
-              <w:left w:w="180" w:type="dxa"/>
-              <w:right w:w="180" w:type="dxa"/>
+              <w:top w:w="120" w:type="dxa"/>
+              <w:bottom w:w="120" w:type="dxa"/>
+              <w:left w:w="160" w:type="dxa"/>
+              <w:right w:w="160" w:type="dxa"/>
             </w:tcMar>
-            <w:tcBorders>
-              <w:top w:val="single" w:sz="4" w:space="0" w:color="D0D7DE"/>
-              <w:left w:val="single" w:sz="4" w:space="0" w:color="D0D7DE"/>
-              <w:bottom w:val="single" w:sz="4" w:space="0" w:color="D0D7DE"/>
-              <w:right w:val="single" w:sz="4" w:space="0" w:color="D0D7DE"/>
-            </w:tcBorders>
           </w:tcPr>
           <w:p>
             <w:pPr>
@@ -920,69 +812,7 @@
             <w:r>
               <w:rPr>
                 <w:rFonts w:ascii="Consolas" w:hAnsi="Consolas"/>
-                <w:color w:val="1F2328"/>
-                <w:sz w:val="17"/>
-              </w:rPr>
-              <w:t>nano scripts/motor_driver.py</w:t>
-            </w:r>
-          </w:p>
-        </w:tc>
-      </w:tr>
-    </w:tbl>
-    <w:p>
-      <w:pPr>
-        <w:spacing w:after="80"/>
-      </w:pPr>
-    </w:p>
-    <w:p>
-      <w:pPr>
-        <w:spacing w:before="200" w:after="60"/>
-      </w:pPr>
-      <w:r>
-        <w:rPr>
-          <w:rFonts w:ascii="Malgun Gothic" w:hAnsi="Malgun Gothic"/>
-          <w:b/>
-          <w:color w:val="1F2328"/>
-          <w:sz w:val="23"/>
-        </w:rPr>
-        <w:t>소스 코드 (motor_driver.py)</w:t>
-      </w:r>
-    </w:p>
-    <w:tbl>
-      <w:tblPr>
-        <w:tblW w:type="auto" w:w="0"/>
-        <w:jc w:val="center"/>
-        <w:tblLook w:firstColumn="1" w:firstRow="1" w:lastColumn="0" w:lastRow="0" w:noHBand="0" w:noVBand="1" w:val="04A0"/>
-      </w:tblPr>
-      <w:tblGrid>
-        <w:gridCol w:w="9648"/>
-      </w:tblGrid>
-      <w:tr>
-        <w:tc>
-          <w:tcPr>
-            <w:tcW w:type="dxa" w:w="9648"/>
-            <w:shd w:fill="F6F8FA"/>
-            <w:tcMar>
-              <w:top w:w="140" w:type="dxa"/>
-              <w:bottom w:w="140" w:type="dxa"/>
-              <w:left w:w="180" w:type="dxa"/>
-              <w:right w:w="180" w:type="dxa"/>
-            </w:tcMar>
-            <w:tcBorders>
-              <w:top w:val="single" w:sz="4" w:space="0" w:color="D0D7DE"/>
-              <w:left w:val="single" w:sz="4" w:space="0" w:color="D0D7DE"/>
-              <w:bottom w:val="single" w:sz="4" w:space="0" w:color="D0D7DE"/>
-              <w:right w:val="single" w:sz="4" w:space="0" w:color="D0D7DE"/>
-            </w:tcBorders>
-          </w:tcPr>
-          <w:p>
-            <w:pPr>
-              <w:spacing w:before="0" w:after="0" w:line="276" w:lineRule="auto"/>
-            </w:pPr>
-            <w:r>
-              <w:rPr>
-                <w:rFonts w:ascii="Consolas" w:hAnsi="Consolas"/>
-                <w:color w:val="1F2328"/>
+                <w:color w:val="000000"/>
                 <w:sz w:val="17"/>
               </w:rPr>
               <w:t>#!/usr/bin/env python3</w:t>
@@ -1141,21 +971,36 @@
     </w:tbl>
     <w:p>
       <w:pPr>
-        <w:spacing w:after="80"/>
+        <w:spacing w:before="0" w:after="80"/>
       </w:pPr>
     </w:p>
     <w:p>
       <w:pPr>
-        <w:spacing w:before="200" w:after="60"/>
+        <w:spacing w:before="120" w:after="40"/>
+        <w:ind w:left="216"/>
       </w:pPr>
       <w:r>
         <w:rPr>
-          <w:rFonts w:ascii="Malgun Gothic" w:hAnsi="Malgun Gothic"/>
+          <w:rFonts w:ascii="Arial Unicode MS" w:hAnsi="Arial Unicode MS"/>
           <w:b/>
-          <w:color w:val="1F2328"/>
-          <w:sz w:val="23"/>
+          <w:color w:val="000000"/>
+          <w:sz w:val="21"/>
         </w:rPr>
-        <w:t>실행 권한 부여 (필수)</w:t>
+        <w:t>3) 실행 권한 부여 (필수)</w:t>
+      </w:r>
+    </w:p>
+    <w:p>
+      <w:pPr>
+        <w:spacing w:before="20" w:after="40"/>
+        <w:ind w:left="432"/>
+      </w:pPr>
+      <w:r>
+        <w:rPr>
+          <w:rFonts w:ascii="Arial Unicode MS" w:hAnsi="Arial Unicode MS"/>
+          <w:color w:val="000000"/>
+          <w:sz w:val="19"/>
+        </w:rPr>
+        <w:t>작성한 파이썬 스크립트에 실행 권한(+x)을 부여합니다:</w:t>
       </w:r>
     </w:p>
     <w:tbl>
@@ -1165,25 +1010,24 @@
         <w:tblLook w:firstColumn="1" w:firstRow="1" w:lastColumn="0" w:lastRow="0" w:noHBand="0" w:noVBand="1" w:val="04A0"/>
       </w:tblPr>
       <w:tblGrid>
-        <w:gridCol w:w="9648"/>
+        <w:gridCol w:w="9317"/>
       </w:tblGrid>
       <w:tr>
         <w:tc>
           <w:tcPr>
-            <w:tcW w:type="dxa" w:w="9648"/>
-            <w:shd w:fill="F6F8FA"/>
+            <w:tcW w:type="dxa" w:w="9072"/>
+            <w:tcBorders>
+              <w:top w:val="single" w:sz="8" w:space="0" w:color="000000"/>
+              <w:left w:val="single" w:sz="8" w:space="0" w:color="000000"/>
+              <w:bottom w:val="single" w:sz="8" w:space="0" w:color="000000"/>
+              <w:right w:val="single" w:sz="8" w:space="0" w:color="000000"/>
+            </w:tcBorders>
             <w:tcMar>
-              <w:top w:w="140" w:type="dxa"/>
-              <w:bottom w:w="140" w:type="dxa"/>
-              <w:left w:w="180" w:type="dxa"/>
-              <w:right w:w="180" w:type="dxa"/>
+              <w:top w:w="120" w:type="dxa"/>
+              <w:bottom w:w="120" w:type="dxa"/>
+              <w:left w:w="160" w:type="dxa"/>
+              <w:right w:w="160" w:type="dxa"/>
             </w:tcMar>
-            <w:tcBorders>
-              <w:top w:val="single" w:sz="4" w:space="0" w:color="D0D7DE"/>
-              <w:left w:val="single" w:sz="4" w:space="0" w:color="D0D7DE"/>
-              <w:bottom w:val="single" w:sz="4" w:space="0" w:color="D0D7DE"/>
-              <w:right w:val="single" w:sz="4" w:space="0" w:color="D0D7DE"/>
-            </w:tcBorders>
           </w:tcPr>
           <w:p>
             <w:pPr>
@@ -1192,7 +1036,7 @@
             <w:r>
               <w:rPr>
                 <w:rFonts w:ascii="Consolas" w:hAnsi="Consolas"/>
-                <w:color w:val="1F2328"/>
+                <w:color w:val="000000"/>
                 <w:sz w:val="17"/>
               </w:rPr>
               <w:t>chmod +x scripts/motor_driver.py</w:t>
@@ -1203,46 +1047,50 @@
     </w:tbl>
     <w:p>
       <w:pPr>
-        <w:spacing w:after="80"/>
+        <w:spacing w:before="0" w:after="80"/>
       </w:pPr>
     </w:p>
     <w:p>
       <w:pPr>
-        <w:spacing w:before="120" w:after="120"/>
-        <w:pBdr>
-          <w:bottom w:val="single" w:sz="6" w:space="1" w:color="D1D9E0"/>
-        </w:pBdr>
-      </w:pPr>
-    </w:p>
-    <w:p>
-      <w:pPr>
-        <w:spacing w:before="240" w:after="80"/>
-        <w:pBdr>
-          <w:bottom w:val="single" w:sz="6" w:space="3" w:color="D1D9E0"/>
-        </w:pBdr>
+        <w:spacing w:before="280" w:after="80"/>
       </w:pPr>
       <w:r>
         <w:rPr>
-          <w:rFonts w:ascii="Malgun Gothic" w:hAnsi="Malgun Gothic"/>
+          <w:rFonts w:ascii="Arial Unicode MS" w:hAnsi="Arial Unicode MS"/>
           <w:b/>
-          <w:color w:val="1F2328"/>
-          <w:sz w:val="28"/>
+          <w:color w:val="000000"/>
+          <w:sz w:val="26"/>
         </w:rPr>
-        <w:t>6. 4단계: 런치(Launch) 파일 만들기</w:t>
+        <w:t>5. 런치(Launch) 파일 작성</w:t>
       </w:r>
     </w:p>
     <w:p>
       <w:pPr>
-        <w:spacing w:before="200" w:after="60"/>
+        <w:spacing w:before="120" w:after="40"/>
+        <w:ind w:left="216"/>
       </w:pPr>
       <w:r>
         <w:rPr>
-          <w:rFonts w:ascii="Malgun Gothic" w:hAnsi="Malgun Gothic"/>
+          <w:rFonts w:ascii="Arial Unicode MS" w:hAnsi="Arial Unicode MS"/>
           <w:b/>
-          <w:color w:val="1F2328"/>
-          <w:sz w:val="23"/>
+          <w:color w:val="000000"/>
+          <w:sz w:val="21"/>
         </w:rPr>
-        <w:t>6.1 로봇용 런치 (launch/robot.launch)</w:t>
+        <w:t>1) 로봇용 런치 파일 : launch/robot.launch</w:t>
+      </w:r>
+    </w:p>
+    <w:p>
+      <w:pPr>
+        <w:spacing w:before="20" w:after="40"/>
+        <w:ind w:left="432"/>
+      </w:pPr>
+      <w:r>
+        <w:rPr>
+          <w:rFonts w:ascii="Arial Unicode MS" w:hAnsi="Arial Unicode MS"/>
+          <w:color w:val="000000"/>
+          <w:sz w:val="19"/>
+        </w:rPr>
+        <w:t>OpenCR 통신 노드와 모터 드라이버 노드를 하나의 프로세스로 함께 실행합니다:</w:t>
       </w:r>
     </w:p>
     <w:tbl>
@@ -1252,25 +1100,24 @@
         <w:tblLook w:firstColumn="1" w:firstRow="1" w:lastColumn="0" w:lastRow="0" w:noHBand="0" w:noVBand="1" w:val="04A0"/>
       </w:tblPr>
       <w:tblGrid>
-        <w:gridCol w:w="9648"/>
+        <w:gridCol w:w="9317"/>
       </w:tblGrid>
       <w:tr>
         <w:tc>
           <w:tcPr>
-            <w:tcW w:type="dxa" w:w="9648"/>
-            <w:shd w:fill="F6F8FA"/>
+            <w:tcW w:type="dxa" w:w="9072"/>
+            <w:tcBorders>
+              <w:top w:val="single" w:sz="8" w:space="0" w:color="000000"/>
+              <w:left w:val="single" w:sz="8" w:space="0" w:color="000000"/>
+              <w:bottom w:val="single" w:sz="8" w:space="0" w:color="000000"/>
+              <w:right w:val="single" w:sz="8" w:space="0" w:color="000000"/>
+            </w:tcBorders>
             <w:tcMar>
-              <w:top w:w="140" w:type="dxa"/>
-              <w:bottom w:w="140" w:type="dxa"/>
-              <w:left w:w="180" w:type="dxa"/>
-              <w:right w:w="180" w:type="dxa"/>
+              <w:top w:w="120" w:type="dxa"/>
+              <w:bottom w:w="120" w:type="dxa"/>
+              <w:left w:w="160" w:type="dxa"/>
+              <w:right w:w="160" w:type="dxa"/>
             </w:tcMar>
-            <w:tcBorders>
-              <w:top w:val="single" w:sz="4" w:space="0" w:color="D0D7DE"/>
-              <w:left w:val="single" w:sz="4" w:space="0" w:color="D0D7DE"/>
-              <w:bottom w:val="single" w:sz="4" w:space="0" w:color="D0D7DE"/>
-              <w:right w:val="single" w:sz="4" w:space="0" w:color="D0D7DE"/>
-            </w:tcBorders>
           </w:tcPr>
           <w:p>
             <w:pPr>
@@ -1279,7 +1126,7 @@
             <w:r>
               <w:rPr>
                 <w:rFonts w:ascii="Consolas" w:hAnsi="Consolas"/>
-                <w:color w:val="1F2328"/>
+                <w:color w:val="000000"/>
                 <w:sz w:val="17"/>
               </w:rPr>
               <w:t>&lt;launch&gt;</w:t>
@@ -1303,21 +1150,36 @@
     </w:tbl>
     <w:p>
       <w:pPr>
-        <w:spacing w:after="80"/>
+        <w:spacing w:before="0" w:after="80"/>
       </w:pPr>
     </w:p>
     <w:p>
       <w:pPr>
-        <w:spacing w:before="200" w:after="60"/>
+        <w:spacing w:before="120" w:after="40"/>
+        <w:ind w:left="216"/>
       </w:pPr>
       <w:r>
         <w:rPr>
-          <w:rFonts w:ascii="Malgun Gothic" w:hAnsi="Malgun Gothic"/>
+          <w:rFonts w:ascii="Arial Unicode MS" w:hAnsi="Arial Unicode MS"/>
           <w:b/>
-          <w:color w:val="1F2328"/>
-          <w:sz w:val="23"/>
+          <w:color w:val="000000"/>
+          <w:sz w:val="21"/>
         </w:rPr>
-        <w:t>6.2 노트북 조종용 런치 (launch/teleop.launch)</w:t>
+        <w:t>2) 노트북 조종용 런치 파일 : launch/teleop.launch</w:t>
+      </w:r>
+    </w:p>
+    <w:p>
+      <w:pPr>
+        <w:spacing w:before="20" w:after="40"/>
+        <w:ind w:left="432"/>
+      </w:pPr>
+      <w:r>
+        <w:rPr>
+          <w:rFonts w:ascii="Arial Unicode MS" w:hAnsi="Arial Unicode MS"/>
+          <w:color w:val="000000"/>
+          <w:sz w:val="19"/>
+        </w:rPr>
+        <w:t>노트북에서 키보드 텔레옵 콘솔 노드를 실행합니다:</w:t>
       </w:r>
     </w:p>
     <w:tbl>
@@ -1327,25 +1189,24 @@
         <w:tblLook w:firstColumn="1" w:firstRow="1" w:lastColumn="0" w:lastRow="0" w:noHBand="0" w:noVBand="1" w:val="04A0"/>
       </w:tblPr>
       <w:tblGrid>
-        <w:gridCol w:w="9648"/>
+        <w:gridCol w:w="9317"/>
       </w:tblGrid>
       <w:tr>
         <w:tc>
           <w:tcPr>
-            <w:tcW w:type="dxa" w:w="9648"/>
-            <w:shd w:fill="F6F8FA"/>
+            <w:tcW w:type="dxa" w:w="9072"/>
+            <w:tcBorders>
+              <w:top w:val="single" w:sz="8" w:space="0" w:color="000000"/>
+              <w:left w:val="single" w:sz="8" w:space="0" w:color="000000"/>
+              <w:bottom w:val="single" w:sz="8" w:space="0" w:color="000000"/>
+              <w:right w:val="single" w:sz="8" w:space="0" w:color="000000"/>
+            </w:tcBorders>
             <w:tcMar>
-              <w:top w:w="140" w:type="dxa"/>
-              <w:bottom w:w="140" w:type="dxa"/>
-              <w:left w:w="180" w:type="dxa"/>
-              <w:right w:w="180" w:type="dxa"/>
+              <w:top w:w="120" w:type="dxa"/>
+              <w:bottom w:w="120" w:type="dxa"/>
+              <w:left w:w="160" w:type="dxa"/>
+              <w:right w:w="160" w:type="dxa"/>
             </w:tcMar>
-            <w:tcBorders>
-              <w:top w:val="single" w:sz="4" w:space="0" w:color="D0D7DE"/>
-              <w:left w:val="single" w:sz="4" w:space="0" w:color="D0D7DE"/>
-              <w:bottom w:val="single" w:sz="4" w:space="0" w:color="D0D7DE"/>
-              <w:right w:val="single" w:sz="4" w:space="0" w:color="D0D7DE"/>
-            </w:tcBorders>
           </w:tcPr>
           <w:p>
             <w:pPr>
@@ -1354,7 +1215,7 @@
             <w:r>
               <w:rPr>
                 <w:rFonts w:ascii="Consolas" w:hAnsi="Consolas"/>
-                <w:color w:val="1F2328"/>
+                <w:color w:val="000000"/>
                 <w:sz w:val="17"/>
               </w:rPr>
               <w:t>&lt;launch&gt;</w:t>
@@ -1369,54 +1230,50 @@
     </w:tbl>
     <w:p>
       <w:pPr>
-        <w:spacing w:after="80"/>
+        <w:spacing w:before="0" w:after="80"/>
       </w:pPr>
     </w:p>
     <w:p>
       <w:pPr>
-        <w:spacing w:before="120" w:after="120"/>
-        <w:pBdr>
-          <w:bottom w:val="single" w:sz="6" w:space="1" w:color="D1D9E0"/>
-        </w:pBdr>
-      </w:pPr>
-    </w:p>
-    <w:p>
-      <w:pPr>
-        <w:spacing w:before="240" w:after="80"/>
-        <w:pBdr>
-          <w:bottom w:val="single" w:sz="6" w:space="3" w:color="D1D9E0"/>
-        </w:pBdr>
+        <w:spacing w:before="280" w:after="80"/>
       </w:pPr>
       <w:r>
         <w:rPr>
-          <w:rFonts w:ascii="Malgun Gothic" w:hAnsi="Malgun Gothic"/>
+          <w:rFonts w:ascii="Arial Unicode MS" w:hAnsi="Arial Unicode MS"/>
           <w:b/>
-          <w:color w:val="1F2328"/>
-          <w:sz w:val="28"/>
+          <w:color w:val="000000"/>
+          <w:sz w:val="26"/>
         </w:rPr>
-        <w:t>7. 5단계: 네트워크 환경 설정 (노트북과 로봇 연결)</w:t>
+        <w:t>6. 네트워크 환경 설정 (노트북과 로봇 무선 연결)</w:t>
       </w:r>
     </w:p>
     <w:p>
       <w:pPr>
-        <w:spacing w:before="200" w:after="60"/>
+        <w:spacing w:before="120" w:after="40"/>
+        <w:ind w:left="216"/>
       </w:pPr>
       <w:r>
         <w:rPr>
-          <w:rFonts w:ascii="Malgun Gothic" w:hAnsi="Malgun Gothic"/>
+          <w:rFonts w:ascii="Arial Unicode MS" w:hAnsi="Arial Unicode MS"/>
           <w:b/>
-          <w:color w:val="1F2328"/>
-          <w:sz w:val="23"/>
+          <w:color w:val="000000"/>
+          <w:sz w:val="21"/>
         </w:rPr>
-        <w:t>7.1 내 IP 확인하기</w:t>
+        <w:t>1) 내 IP 확인하기</w:t>
       </w:r>
     </w:p>
     <w:p>
       <w:pPr>
-        <w:spacing w:before="40" w:after="40"/>
+        <w:spacing w:before="20" w:after="40"/>
+        <w:ind w:left="432"/>
       </w:pPr>
       <w:r>
-        <w:t>터미널에서 아래 명령어로 IP를 확인합니다:</w:t>
+        <w:rPr>
+          <w:rFonts w:ascii="Arial Unicode MS" w:hAnsi="Arial Unicode MS"/>
+          <w:color w:val="000000"/>
+          <w:sz w:val="19"/>
+        </w:rPr>
+        <w:t>노트북과 로봇 각각 터미널에서 자신의 Wi-Fi IP 주소를 확인합니다:</w:t>
       </w:r>
     </w:p>
     <w:tbl>
@@ -1426,25 +1283,24 @@
         <w:tblLook w:firstColumn="1" w:firstRow="1" w:lastColumn="0" w:lastRow="0" w:noHBand="0" w:noVBand="1" w:val="04A0"/>
       </w:tblPr>
       <w:tblGrid>
-        <w:gridCol w:w="9648"/>
+        <w:gridCol w:w="9317"/>
       </w:tblGrid>
       <w:tr>
         <w:tc>
           <w:tcPr>
-            <w:tcW w:type="dxa" w:w="9648"/>
-            <w:shd w:fill="F6F8FA"/>
+            <w:tcW w:type="dxa" w:w="9072"/>
+            <w:tcBorders>
+              <w:top w:val="single" w:sz="8" w:space="0" w:color="000000"/>
+              <w:left w:val="single" w:sz="8" w:space="0" w:color="000000"/>
+              <w:bottom w:val="single" w:sz="8" w:space="0" w:color="000000"/>
+              <w:right w:val="single" w:sz="8" w:space="0" w:color="000000"/>
+            </w:tcBorders>
             <w:tcMar>
-              <w:top w:w="140" w:type="dxa"/>
-              <w:bottom w:w="140" w:type="dxa"/>
-              <w:left w:w="180" w:type="dxa"/>
-              <w:right w:w="180" w:type="dxa"/>
+              <w:top w:w="120" w:type="dxa"/>
+              <w:bottom w:w="120" w:type="dxa"/>
+              <w:left w:w="160" w:type="dxa"/>
+              <w:right w:w="160" w:type="dxa"/>
             </w:tcMar>
-            <w:tcBorders>
-              <w:top w:val="single" w:sz="4" w:space="0" w:color="D0D7DE"/>
-              <w:left w:val="single" w:sz="4" w:space="0" w:color="D0D7DE"/>
-              <w:bottom w:val="single" w:sz="4" w:space="0" w:color="D0D7DE"/>
-              <w:right w:val="single" w:sz="4" w:space="0" w:color="D0D7DE"/>
-            </w:tcBorders>
           </w:tcPr>
           <w:p>
             <w:pPr>
@@ -1453,7 +1309,7 @@
             <w:r>
               <w:rPr>
                 <w:rFonts w:ascii="Consolas" w:hAnsi="Consolas"/>
-                <w:color w:val="1F2328"/>
+                <w:color w:val="000000"/>
                 <w:sz w:val="17"/>
               </w:rPr>
               <w:t>hostname -I</w:t>
@@ -1464,47 +1320,65 @@
     </w:tbl>
     <w:p>
       <w:pPr>
-        <w:spacing w:after="80"/>
+        <w:spacing w:before="0" w:after="80"/>
       </w:pPr>
     </w:p>
     <w:p>
       <w:pPr>
-        <w:spacing w:before="200" w:after="60"/>
+        <w:spacing w:before="120" w:after="40"/>
+        <w:ind w:left="216"/>
       </w:pPr>
       <w:r>
         <w:rPr>
-          <w:rFonts w:ascii="Malgun Gothic" w:hAnsi="Malgun Gothic"/>
+          <w:rFonts w:ascii="Arial Unicode MS" w:hAnsi="Arial Unicode MS"/>
           <w:b/>
-          <w:color w:val="1F2328"/>
-          <w:sz w:val="23"/>
+          <w:color w:val="000000"/>
+          <w:sz w:val="21"/>
         </w:rPr>
-        <w:t>7.2 환경변수 설정</w:t>
+        <w:t>2) 환경변수 설정 원리</w:t>
       </w:r>
     </w:p>
     <w:p>
       <w:pPr>
-        <w:pStyle w:val="ListBullet"/>
-        <w:spacing w:before="20" w:after="20"/>
+        <w:spacing w:before="20" w:after="40"/>
+        <w:ind w:left="432"/>
       </w:pPr>
       <w:r>
-        <w:t>ROS_MASTER_URI: roscore가 켜져 있는 로봇의 IP를 양쪽 컴퓨터에 똑같이 적어줍니다.</w:t>
+        <w:rPr>
+          <w:rFonts w:ascii="Arial Unicode MS" w:hAnsi="Arial Unicode MS"/>
+          <w:color w:val="000000"/>
+          <w:sz w:val="19"/>
+        </w:rPr>
+        <w:t>- ROS_MASTER_URI : roscore가 실행 중인 로봇의 IP 주소 (양쪽 모두 동일하게 입력)</w:t>
       </w:r>
     </w:p>
     <w:p>
       <w:pPr>
-        <w:pStyle w:val="ListBullet"/>
-        <w:spacing w:before="20" w:after="20"/>
+        <w:spacing w:before="20" w:after="40"/>
+        <w:ind w:left="432"/>
       </w:pPr>
       <w:r>
-        <w:t>ROS_IP: 지금 명령어를 치고 있는 내 컴퓨터의 IP를 적어줍니다.</w:t>
+        <w:rPr>
+          <w:rFonts w:ascii="Arial Unicode MS" w:hAnsi="Arial Unicode MS"/>
+          <w:color w:val="000000"/>
+          <w:sz w:val="19"/>
+        </w:rPr>
+        <w:t>- ROS_IP : 현재 명령어를 입력하고 있는 컴퓨터 본인의 IP 주소</w:t>
       </w:r>
     </w:p>
     <w:p>
       <w:pPr>
-        <w:spacing w:before="40" w:after="40"/>
+        <w:spacing w:before="120" w:after="40"/>
+        <w:ind w:left="216"/>
       </w:pPr>
       <w:r>
-        <w:t>**로봇 터미널:**</w:t>
+        <w:rPr>
+          <w:rFonts w:ascii="Arial Unicode MS" w:hAnsi="Arial Unicode MS"/>
+          <w:b/>
+          <w:color w:val="000000"/>
+          <w:sz w:val="21"/>
+        </w:rPr>
+        <w:t>3) 로봇 환경변수 등록</w:t>
       </w:r>
     </w:p>
     <w:tbl>
@@ -1514,25 +1388,24 @@
         <w:tblLook w:firstColumn="1" w:firstRow="1" w:lastColumn="0" w:lastRow="0" w:noHBand="0" w:noVBand="1" w:val="04A0"/>
       </w:tblPr>
       <w:tblGrid>
-        <w:gridCol w:w="9648"/>
+        <w:gridCol w:w="9317"/>
       </w:tblGrid>
       <w:tr>
         <w:tc>
           <w:tcPr>
-            <w:tcW w:type="dxa" w:w="9648"/>
-            <w:shd w:fill="F6F8FA"/>
+            <w:tcW w:type="dxa" w:w="9072"/>
+            <w:tcBorders>
+              <w:top w:val="single" w:sz="8" w:space="0" w:color="000000"/>
+              <w:left w:val="single" w:sz="8" w:space="0" w:color="000000"/>
+              <w:bottom w:val="single" w:sz="8" w:space="0" w:color="000000"/>
+              <w:right w:val="single" w:sz="8" w:space="0" w:color="000000"/>
+            </w:tcBorders>
             <w:tcMar>
-              <w:top w:w="140" w:type="dxa"/>
-              <w:bottom w:w="140" w:type="dxa"/>
-              <w:left w:w="180" w:type="dxa"/>
-              <w:right w:w="180" w:type="dxa"/>
+              <w:top w:w="120" w:type="dxa"/>
+              <w:bottom w:w="120" w:type="dxa"/>
+              <w:left w:w="160" w:type="dxa"/>
+              <w:right w:w="160" w:type="dxa"/>
             </w:tcMar>
-            <w:tcBorders>
-              <w:top w:val="single" w:sz="4" w:space="0" w:color="D0D7DE"/>
-              <w:left w:val="single" w:sz="4" w:space="0" w:color="D0D7DE"/>
-              <w:bottom w:val="single" w:sz="4" w:space="0" w:color="D0D7DE"/>
-              <w:right w:val="single" w:sz="4" w:space="0" w:color="D0D7DE"/>
-            </w:tcBorders>
           </w:tcPr>
           <w:p>
             <w:pPr>
@@ -1541,7 +1414,7 @@
             <w:r>
               <w:rPr>
                 <w:rFonts w:ascii="Consolas" w:hAnsi="Consolas"/>
-                <w:color w:val="1F2328"/>
+                <w:color w:val="000000"/>
                 <w:sz w:val="17"/>
               </w:rPr>
               <w:t>export ROS_MASTER_URI=http://&lt;로봇IP&gt;:11311</w:t>
@@ -1554,15 +1427,22 @@
     </w:tbl>
     <w:p>
       <w:pPr>
-        <w:spacing w:after="80"/>
+        <w:spacing w:before="0" w:after="80"/>
       </w:pPr>
     </w:p>
     <w:p>
       <w:pPr>
-        <w:spacing w:before="40" w:after="40"/>
+        <w:spacing w:before="120" w:after="40"/>
+        <w:ind w:left="216"/>
       </w:pPr>
       <w:r>
-        <w:t>**노트북 터미널:**</w:t>
+        <w:rPr>
+          <w:rFonts w:ascii="Arial Unicode MS" w:hAnsi="Arial Unicode MS"/>
+          <w:b/>
+          <w:color w:val="000000"/>
+          <w:sz w:val="21"/>
+        </w:rPr>
+        <w:t>4) 노트북 환경변수 등록</w:t>
       </w:r>
     </w:p>
     <w:tbl>
@@ -1572,25 +1452,24 @@
         <w:tblLook w:firstColumn="1" w:firstRow="1" w:lastColumn="0" w:lastRow="0" w:noHBand="0" w:noVBand="1" w:val="04A0"/>
       </w:tblPr>
       <w:tblGrid>
-        <w:gridCol w:w="9648"/>
+        <w:gridCol w:w="9317"/>
       </w:tblGrid>
       <w:tr>
         <w:tc>
           <w:tcPr>
-            <w:tcW w:type="dxa" w:w="9648"/>
-            <w:shd w:fill="F6F8FA"/>
+            <w:tcW w:type="dxa" w:w="9072"/>
+            <w:tcBorders>
+              <w:top w:val="single" w:sz="8" w:space="0" w:color="000000"/>
+              <w:left w:val="single" w:sz="8" w:space="0" w:color="000000"/>
+              <w:bottom w:val="single" w:sz="8" w:space="0" w:color="000000"/>
+              <w:right w:val="single" w:sz="8" w:space="0" w:color="000000"/>
+            </w:tcBorders>
             <w:tcMar>
-              <w:top w:w="140" w:type="dxa"/>
-              <w:bottom w:w="140" w:type="dxa"/>
-              <w:left w:w="180" w:type="dxa"/>
-              <w:right w:w="180" w:type="dxa"/>
+              <w:top w:w="120" w:type="dxa"/>
+              <w:bottom w:w="120" w:type="dxa"/>
+              <w:left w:w="160" w:type="dxa"/>
+              <w:right w:w="160" w:type="dxa"/>
             </w:tcMar>
-            <w:tcBorders>
-              <w:top w:val="single" w:sz="4" w:space="0" w:color="D0D7DE"/>
-              <w:left w:val="single" w:sz="4" w:space="0" w:color="D0D7DE"/>
-              <w:bottom w:val="single" w:sz="4" w:space="0" w:color="D0D7DE"/>
-              <w:right w:val="single" w:sz="4" w:space="0" w:color="D0D7DE"/>
-            </w:tcBorders>
           </w:tcPr>
           <w:p>
             <w:pPr>
@@ -1599,7 +1478,7 @@
             <w:r>
               <w:rPr>
                 <w:rFonts w:ascii="Consolas" w:hAnsi="Consolas"/>
-                <w:color w:val="1F2328"/>
+                <w:color w:val="000000"/>
                 <w:sz w:val="17"/>
               </w:rPr>
               <w:t>export ROS_MASTER_URI=http://&lt;로봇IP&gt;:11311</w:t>
@@ -1612,46 +1491,50 @@
     </w:tbl>
     <w:p>
       <w:pPr>
-        <w:spacing w:after="80"/>
+        <w:spacing w:before="0" w:after="80"/>
       </w:pPr>
     </w:p>
     <w:p>
       <w:pPr>
-        <w:spacing w:before="120" w:after="120"/>
-        <w:pBdr>
-          <w:bottom w:val="single" w:sz="6" w:space="1" w:color="D1D9E0"/>
-        </w:pBdr>
-      </w:pPr>
-    </w:p>
-    <w:p>
-      <w:pPr>
-        <w:spacing w:before="240" w:after="80"/>
-        <w:pBdr>
-          <w:bottom w:val="single" w:sz="6" w:space="3" w:color="D1D9E0"/>
-        </w:pBdr>
+        <w:spacing w:before="280" w:after="80"/>
       </w:pPr>
       <w:r>
         <w:rPr>
-          <w:rFonts w:ascii="Malgun Gothic" w:hAnsi="Malgun Gothic"/>
+          <w:rFonts w:ascii="Arial Unicode MS" w:hAnsi="Arial Unicode MS"/>
           <w:b/>
-          <w:color w:val="1F2328"/>
-          <w:sz w:val="28"/>
+          <w:color w:val="000000"/>
+          <w:sz w:val="26"/>
         </w:rPr>
-        <w:t>8. 6단계: 로봇 조종 실습하기</w:t>
+        <w:t>7. 로봇 주행 실습</w:t>
       </w:r>
     </w:p>
     <w:p>
       <w:pPr>
-        <w:spacing w:before="200" w:after="60"/>
+        <w:spacing w:before="120" w:after="40"/>
+        <w:ind w:left="216"/>
       </w:pPr>
       <w:r>
         <w:rPr>
-          <w:rFonts w:ascii="Malgun Gothic" w:hAnsi="Malgun Gothic"/>
+          <w:rFonts w:ascii="Arial Unicode MS" w:hAnsi="Arial Unicode MS"/>
           <w:b/>
-          <w:color w:val="1F2328"/>
-          <w:sz w:val="23"/>
+          <w:color w:val="000000"/>
+          <w:sz w:val="21"/>
         </w:rPr>
-        <w:t>[1] 빌드하기</w:t>
+        <w:t>1) 워크스페이스 빌드하기</w:t>
+      </w:r>
+    </w:p>
+    <w:p>
+      <w:pPr>
+        <w:spacing w:before="20" w:after="40"/>
+        <w:ind w:left="432"/>
+      </w:pPr>
+      <w:r>
+        <w:rPr>
+          <w:rFonts w:ascii="Arial Unicode MS" w:hAnsi="Arial Unicode MS"/>
+          <w:color w:val="000000"/>
+          <w:sz w:val="19"/>
+        </w:rPr>
+        <w:t>노트북과 로봇의 워크스페이스에서 빌드를 수행합니다:</w:t>
       </w:r>
     </w:p>
     <w:tbl>
@@ -1661,25 +1544,24 @@
         <w:tblLook w:firstColumn="1" w:firstRow="1" w:lastColumn="0" w:lastRow="0" w:noHBand="0" w:noVBand="1" w:val="04A0"/>
       </w:tblPr>
       <w:tblGrid>
-        <w:gridCol w:w="9648"/>
+        <w:gridCol w:w="9317"/>
       </w:tblGrid>
       <w:tr>
         <w:tc>
           <w:tcPr>
-            <w:tcW w:type="dxa" w:w="9648"/>
-            <w:shd w:fill="F6F8FA"/>
+            <w:tcW w:type="dxa" w:w="9072"/>
+            <w:tcBorders>
+              <w:top w:val="single" w:sz="8" w:space="0" w:color="000000"/>
+              <w:left w:val="single" w:sz="8" w:space="0" w:color="000000"/>
+              <w:bottom w:val="single" w:sz="8" w:space="0" w:color="000000"/>
+              <w:right w:val="single" w:sz="8" w:space="0" w:color="000000"/>
+            </w:tcBorders>
             <w:tcMar>
-              <w:top w:w="140" w:type="dxa"/>
-              <w:bottom w:w="140" w:type="dxa"/>
-              <w:left w:w="180" w:type="dxa"/>
-              <w:right w:w="180" w:type="dxa"/>
+              <w:top w:w="120" w:type="dxa"/>
+              <w:bottom w:w="120" w:type="dxa"/>
+              <w:left w:w="160" w:type="dxa"/>
+              <w:right w:w="160" w:type="dxa"/>
             </w:tcMar>
-            <w:tcBorders>
-              <w:top w:val="single" w:sz="4" w:space="0" w:color="D0D7DE"/>
-              <w:left w:val="single" w:sz="4" w:space="0" w:color="D0D7DE"/>
-              <w:bottom w:val="single" w:sz="4" w:space="0" w:color="D0D7DE"/>
-              <w:right w:val="single" w:sz="4" w:space="0" w:color="D0D7DE"/>
-            </w:tcBorders>
           </w:tcPr>
           <w:p>
             <w:pPr>
@@ -1688,7 +1570,7 @@
             <w:r>
               <w:rPr>
                 <w:rFonts w:ascii="Consolas" w:hAnsi="Consolas"/>
-                <w:color w:val="1F2328"/>
+                <w:color w:val="000000"/>
                 <w:sz w:val="17"/>
               </w:rPr>
               <w:t>cd ~/turtle_ws</w:t>
@@ -1703,21 +1585,36 @@
     </w:tbl>
     <w:p>
       <w:pPr>
-        <w:spacing w:after="80"/>
+        <w:spacing w:before="0" w:after="80"/>
       </w:pPr>
     </w:p>
     <w:p>
       <w:pPr>
-        <w:spacing w:before="200" w:after="60"/>
+        <w:spacing w:before="120" w:after="40"/>
+        <w:ind w:left="216"/>
       </w:pPr>
       <w:r>
         <w:rPr>
-          <w:rFonts w:ascii="Malgun Gothic" w:hAnsi="Malgun Gothic"/>
+          <w:rFonts w:ascii="Arial Unicode MS" w:hAnsi="Arial Unicode MS"/>
           <w:b/>
-          <w:color w:val="1F2328"/>
-          <w:sz w:val="23"/>
+          <w:color w:val="000000"/>
+          <w:sz w:val="21"/>
         </w:rPr>
-        <w:t>[2] 로봇에서 모터 노드 실행</w:t>
+        <w:t>2) 로봇에서 모터 노드 실행</w:t>
+      </w:r>
+    </w:p>
+    <w:p>
+      <w:pPr>
+        <w:spacing w:before="20" w:after="40"/>
+        <w:ind w:left="432"/>
+      </w:pPr>
+      <w:r>
+        <w:rPr>
+          <w:rFonts w:ascii="Arial Unicode MS" w:hAnsi="Arial Unicode MS"/>
+          <w:color w:val="000000"/>
+          <w:sz w:val="19"/>
+        </w:rPr>
+        <w:t>로봇에 SSH 접속하거나 로봇 본체에서 아래 명령을 실행합니다:</w:t>
       </w:r>
     </w:p>
     <w:tbl>
@@ -1727,25 +1624,24 @@
         <w:tblLook w:firstColumn="1" w:firstRow="1" w:lastColumn="0" w:lastRow="0" w:noHBand="0" w:noVBand="1" w:val="04A0"/>
       </w:tblPr>
       <w:tblGrid>
-        <w:gridCol w:w="9648"/>
+        <w:gridCol w:w="9317"/>
       </w:tblGrid>
       <w:tr>
         <w:tc>
           <w:tcPr>
-            <w:tcW w:type="dxa" w:w="9648"/>
-            <w:shd w:fill="F6F8FA"/>
+            <w:tcW w:type="dxa" w:w="9072"/>
+            <w:tcBorders>
+              <w:top w:val="single" w:sz="8" w:space="0" w:color="000000"/>
+              <w:left w:val="single" w:sz="8" w:space="0" w:color="000000"/>
+              <w:bottom w:val="single" w:sz="8" w:space="0" w:color="000000"/>
+              <w:right w:val="single" w:sz="8" w:space="0" w:color="000000"/>
+            </w:tcBorders>
             <w:tcMar>
-              <w:top w:w="140" w:type="dxa"/>
-              <w:bottom w:w="140" w:type="dxa"/>
-              <w:left w:w="180" w:type="dxa"/>
-              <w:right w:w="180" w:type="dxa"/>
+              <w:top w:w="120" w:type="dxa"/>
+              <w:bottom w:w="120" w:type="dxa"/>
+              <w:left w:w="160" w:type="dxa"/>
+              <w:right w:w="160" w:type="dxa"/>
             </w:tcMar>
-            <w:tcBorders>
-              <w:top w:val="single" w:sz="4" w:space="0" w:color="D0D7DE"/>
-              <w:left w:val="single" w:sz="4" w:space="0" w:color="D0D7DE"/>
-              <w:bottom w:val="single" w:sz="4" w:space="0" w:color="D0D7DE"/>
-              <w:right w:val="single" w:sz="4" w:space="0" w:color="D0D7DE"/>
-            </w:tcBorders>
           </w:tcPr>
           <w:p>
             <w:pPr>
@@ -1754,7 +1650,7 @@
             <w:r>
               <w:rPr>
                 <w:rFonts w:ascii="Consolas" w:hAnsi="Consolas"/>
-                <w:color w:val="1F2328"/>
+                <w:color w:val="000000"/>
                 <w:sz w:val="17"/>
               </w:rPr>
               <w:t>roslaunch srobot robot.launch</w:t>
@@ -1765,21 +1661,36 @@
     </w:tbl>
     <w:p>
       <w:pPr>
-        <w:spacing w:after="80"/>
+        <w:spacing w:before="0" w:after="80"/>
       </w:pPr>
     </w:p>
     <w:p>
       <w:pPr>
-        <w:spacing w:before="200" w:after="60"/>
+        <w:spacing w:before="120" w:after="40"/>
+        <w:ind w:left="216"/>
       </w:pPr>
       <w:r>
         <w:rPr>
-          <w:rFonts w:ascii="Malgun Gothic" w:hAnsi="Malgun Gothic"/>
+          <w:rFonts w:ascii="Arial Unicode MS" w:hAnsi="Arial Unicode MS"/>
           <w:b/>
-          <w:color w:val="1F2328"/>
-          <w:sz w:val="23"/>
+          <w:color w:val="000000"/>
+          <w:sz w:val="21"/>
         </w:rPr>
-        <w:t>[3] 노트북에서 조종 콘솔 실행</w:t>
+        <w:t>3) 노트북에서 조종 콘솔 실행</w:t>
+      </w:r>
+    </w:p>
+    <w:p>
+      <w:pPr>
+        <w:spacing w:before="20" w:after="40"/>
+        <w:ind w:left="432"/>
+      </w:pPr>
+      <w:r>
+        <w:rPr>
+          <w:rFonts w:ascii="Arial Unicode MS" w:hAnsi="Arial Unicode MS"/>
+          <w:color w:val="000000"/>
+          <w:sz w:val="19"/>
+        </w:rPr>
+        <w:t>노트북 터미널에서 키보드 텔레옵 콘솔을 실행합니다:</w:t>
       </w:r>
     </w:p>
     <w:tbl>
@@ -1789,25 +1700,24 @@
         <w:tblLook w:firstColumn="1" w:firstRow="1" w:lastColumn="0" w:lastRow="0" w:noHBand="0" w:noVBand="1" w:val="04A0"/>
       </w:tblPr>
       <w:tblGrid>
-        <w:gridCol w:w="9648"/>
+        <w:gridCol w:w="9317"/>
       </w:tblGrid>
       <w:tr>
         <w:tc>
           <w:tcPr>
-            <w:tcW w:type="dxa" w:w="9648"/>
-            <w:shd w:fill="F6F8FA"/>
+            <w:tcW w:type="dxa" w:w="9072"/>
+            <w:tcBorders>
+              <w:top w:val="single" w:sz="8" w:space="0" w:color="000000"/>
+              <w:left w:val="single" w:sz="8" w:space="0" w:color="000000"/>
+              <w:bottom w:val="single" w:sz="8" w:space="0" w:color="000000"/>
+              <w:right w:val="single" w:sz="8" w:space="0" w:color="000000"/>
+            </w:tcBorders>
             <w:tcMar>
-              <w:top w:w="140" w:type="dxa"/>
-              <w:bottom w:w="140" w:type="dxa"/>
-              <w:left w:w="180" w:type="dxa"/>
-              <w:right w:w="180" w:type="dxa"/>
+              <w:top w:w="120" w:type="dxa"/>
+              <w:bottom w:w="120" w:type="dxa"/>
+              <w:left w:w="160" w:type="dxa"/>
+              <w:right w:w="160" w:type="dxa"/>
             </w:tcMar>
-            <w:tcBorders>
-              <w:top w:val="single" w:sz="4" w:space="0" w:color="D0D7DE"/>
-              <w:left w:val="single" w:sz="4" w:space="0" w:color="D0D7DE"/>
-              <w:bottom w:val="single" w:sz="4" w:space="0" w:color="D0D7DE"/>
-              <w:right w:val="single" w:sz="4" w:space="0" w:color="D0D7DE"/>
-            </w:tcBorders>
           </w:tcPr>
           <w:p>
             <w:pPr>
@@ -1816,7 +1726,7 @@
             <w:r>
               <w:rPr>
                 <w:rFonts w:ascii="Consolas" w:hAnsi="Consolas"/>
-                <w:color w:val="1F2328"/>
+                <w:color w:val="000000"/>
                 <w:sz w:val="17"/>
               </w:rPr>
               <w:t>roslaunch srobot teleop.launch</w:t>
@@ -1827,98 +1737,614 @@
     </w:tbl>
     <w:p>
       <w:pPr>
-        <w:spacing w:after="80"/>
+        <w:spacing w:before="0" w:after="80"/>
       </w:pPr>
     </w:p>
     <w:p>
       <w:pPr>
-        <w:spacing w:before="200" w:after="60"/>
+        <w:spacing w:before="120" w:after="40"/>
+        <w:ind w:left="216"/>
       </w:pPr>
       <w:r>
         <w:rPr>
-          <w:rFonts w:ascii="Malgun Gothic" w:hAnsi="Malgun Gothic"/>
+          <w:rFonts w:ascii="Arial Unicode MS" w:hAnsi="Arial Unicode MS"/>
           <w:b/>
-          <w:color w:val="1F2328"/>
-          <w:sz w:val="23"/>
+          <w:color w:val="000000"/>
+          <w:sz w:val="21"/>
         </w:rPr>
-        <w:t>[4] 키보드로 조종하기</w:t>
+        <w:t>4) 키보드 조종 가이드</w:t>
       </w:r>
     </w:p>
     <w:p>
       <w:pPr>
-        <w:pStyle w:val="ListBullet"/>
-        <w:spacing w:before="20" w:after="20"/>
+        <w:spacing w:before="20" w:after="40"/>
+        <w:ind w:left="432"/>
       </w:pPr>
       <w:r>
-        <w:t>w: 전진</w:t>
+        <w:rPr>
+          <w:rFonts w:ascii="Arial Unicode MS" w:hAnsi="Arial Unicode MS"/>
+          <w:color w:val="000000"/>
+          <w:sz w:val="19"/>
+        </w:rPr>
+        <w:t>콘솔 창에 키를 누르면 로봇이 엔터 없이 즉각 반응하여 주행합니다:</w:t>
       </w:r>
     </w:p>
-    <w:p>
-      <w:pPr>
-        <w:pStyle w:val="ListBullet"/>
-        <w:spacing w:before="20" w:after="20"/>
-      </w:pPr>
-      <w:r>
-        <w:t>x: 후진</w:t>
-      </w:r>
-    </w:p>
-    <w:p>
-      <w:pPr>
-        <w:pStyle w:val="ListBullet"/>
-        <w:spacing w:before="20" w:after="20"/>
-      </w:pPr>
-      <w:r>
-        <w:t>a: 좌회전</w:t>
-      </w:r>
-    </w:p>
-    <w:p>
-      <w:pPr>
-        <w:pStyle w:val="ListBullet"/>
-        <w:spacing w:before="20" w:after="20"/>
-      </w:pPr>
-      <w:r>
-        <w:t>d: 우회전</w:t>
-      </w:r>
-    </w:p>
-    <w:p>
-      <w:pPr>
-        <w:pStyle w:val="ListBullet"/>
-        <w:spacing w:before="20" w:after="20"/>
-      </w:pPr>
-      <w:r>
-        <w:t>s: 정지</w:t>
-      </w:r>
-    </w:p>
-    <w:p>
-      <w:pPr>
-        <w:pStyle w:val="ListBullet"/>
-        <w:spacing w:before="20" w:after="20"/>
-      </w:pPr>
-      <w:r>
-        <w:t>e: 속도 증가</w:t>
-      </w:r>
-    </w:p>
-    <w:p>
-      <w:pPr>
-        <w:pStyle w:val="ListBullet"/>
-        <w:spacing w:before="20" w:after="20"/>
-      </w:pPr>
-      <w:r>
-        <w:t>c: 속도 감소</w:t>
-      </w:r>
-    </w:p>
-    <w:p>
-      <w:pPr>
-        <w:pStyle w:val="ListBullet"/>
-        <w:spacing w:before="20" w:after="20"/>
-      </w:pPr>
-      <w:r>
-        <w:t>q: 종료</w:t>
-      </w:r>
-    </w:p>
+    <w:tbl>
+      <w:tblPr>
+        <w:tblW w:type="auto" w:w="0"/>
+        <w:jc w:val="center"/>
+        <w:tblLook w:firstColumn="1" w:firstRow="1" w:lastColumn="0" w:lastRow="0" w:noHBand="0" w:noVBand="1" w:val="04A0"/>
+      </w:tblPr>
+      <w:tblGrid>
+        <w:gridCol w:w="3106"/>
+        <w:gridCol w:w="3106"/>
+        <w:gridCol w:w="3106"/>
+      </w:tblGrid>
+      <w:tr>
+        <w:tc>
+          <w:tcPr>
+            <w:tcW w:type="dxa" w:w="3106"/>
+            <w:tcBorders>
+              <w:top w:val="single" w:sz="8" w:space="0" w:color="000000"/>
+              <w:left w:val="single" w:sz="8" w:space="0" w:color="000000"/>
+              <w:bottom w:val="single" w:sz="8" w:space="0" w:color="000000"/>
+              <w:right w:val="single" w:sz="8" w:space="0" w:color="000000"/>
+            </w:tcBorders>
+          </w:tcPr>
+          <w:p>
+            <w:r>
+              <w:rPr>
+                <w:rFonts w:ascii="Arial Unicode MS" w:hAnsi="Arial Unicode MS"/>
+                <w:b/>
+                <w:sz w:val="19"/>
+              </w:rPr>
+              <w:t>키 (Key)</w:t>
+            </w:r>
+          </w:p>
+        </w:tc>
+        <w:tc>
+          <w:tcPr>
+            <w:tcW w:type="dxa" w:w="3106"/>
+            <w:tcBorders>
+              <w:top w:val="single" w:sz="8" w:space="0" w:color="000000"/>
+              <w:left w:val="single" w:sz="8" w:space="0" w:color="000000"/>
+              <w:bottom w:val="single" w:sz="8" w:space="0" w:color="000000"/>
+              <w:right w:val="single" w:sz="8" w:space="0" w:color="000000"/>
+            </w:tcBorders>
+          </w:tcPr>
+          <w:p>
+            <w:r>
+              <w:rPr>
+                <w:rFonts w:ascii="Arial Unicode MS" w:hAnsi="Arial Unicode MS"/>
+                <w:b/>
+                <w:sz w:val="19"/>
+              </w:rPr>
+              <w:t>동작 (Action)</w:t>
+            </w:r>
+          </w:p>
+        </w:tc>
+        <w:tc>
+          <w:tcPr>
+            <w:tcW w:type="dxa" w:w="3106"/>
+            <w:tcBorders>
+              <w:top w:val="single" w:sz="8" w:space="0" w:color="000000"/>
+              <w:left w:val="single" w:sz="8" w:space="0" w:color="000000"/>
+              <w:bottom w:val="single" w:sz="8" w:space="0" w:color="000000"/>
+              <w:right w:val="single" w:sz="8" w:space="0" w:color="000000"/>
+            </w:tcBorders>
+          </w:tcPr>
+          <w:p>
+            <w:r>
+              <w:rPr>
+                <w:rFonts w:ascii="Arial Unicode MS" w:hAnsi="Arial Unicode MS"/>
+                <w:b/>
+                <w:sz w:val="19"/>
+              </w:rPr>
+              <w:t>상세 설명</w:t>
+            </w:r>
+          </w:p>
+        </w:tc>
+      </w:tr>
+      <w:tr>
+        <w:tc>
+          <w:tcPr>
+            <w:tcW w:type="dxa" w:w="3106"/>
+            <w:tcBorders>
+              <w:top w:val="single" w:sz="8" w:space="0" w:color="000000"/>
+              <w:left w:val="single" w:sz="8" w:space="0" w:color="000000"/>
+              <w:bottom w:val="single" w:sz="8" w:space="0" w:color="000000"/>
+              <w:right w:val="single" w:sz="8" w:space="0" w:color="000000"/>
+            </w:tcBorders>
+          </w:tcPr>
+          <w:p>
+            <w:r>
+              <w:rPr>
+                <w:rFonts w:ascii="Arial Unicode MS" w:hAnsi="Arial Unicode MS"/>
+                <w:sz w:val="18"/>
+              </w:rPr>
+              <w:t>w</w:t>
+            </w:r>
+          </w:p>
+        </w:tc>
+        <w:tc>
+          <w:tcPr>
+            <w:tcW w:type="dxa" w:w="3106"/>
+            <w:tcBorders>
+              <w:top w:val="single" w:sz="8" w:space="0" w:color="000000"/>
+              <w:left w:val="single" w:sz="8" w:space="0" w:color="000000"/>
+              <w:bottom w:val="single" w:sz="8" w:space="0" w:color="000000"/>
+              <w:right w:val="single" w:sz="8" w:space="0" w:color="000000"/>
+            </w:tcBorders>
+          </w:tcPr>
+          <w:p>
+            <w:r>
+              <w:rPr>
+                <w:rFonts w:ascii="Arial Unicode MS" w:hAnsi="Arial Unicode MS"/>
+                <w:sz w:val="18"/>
+              </w:rPr>
+              <w:t>전진</w:t>
+            </w:r>
+          </w:p>
+        </w:tc>
+        <w:tc>
+          <w:tcPr>
+            <w:tcW w:type="dxa" w:w="3106"/>
+            <w:tcBorders>
+              <w:top w:val="single" w:sz="8" w:space="0" w:color="000000"/>
+              <w:left w:val="single" w:sz="8" w:space="0" w:color="000000"/>
+              <w:bottom w:val="single" w:sz="8" w:space="0" w:color="000000"/>
+              <w:right w:val="single" w:sz="8" w:space="0" w:color="000000"/>
+            </w:tcBorders>
+          </w:tcPr>
+          <w:p>
+            <w:r>
+              <w:rPr>
+                <w:rFonts w:ascii="Arial Unicode MS" w:hAnsi="Arial Unicode MS"/>
+                <w:sz w:val="18"/>
+              </w:rPr>
+              <w:t>현재 설정된 선속도로 앞쪽 주행</w:t>
+            </w:r>
+          </w:p>
+        </w:tc>
+      </w:tr>
+      <w:tr>
+        <w:tc>
+          <w:tcPr>
+            <w:tcW w:type="dxa" w:w="3106"/>
+            <w:tcBorders>
+              <w:top w:val="single" w:sz="8" w:space="0" w:color="000000"/>
+              <w:left w:val="single" w:sz="8" w:space="0" w:color="000000"/>
+              <w:bottom w:val="single" w:sz="8" w:space="0" w:color="000000"/>
+              <w:right w:val="single" w:sz="8" w:space="0" w:color="000000"/>
+            </w:tcBorders>
+          </w:tcPr>
+          <w:p>
+            <w:r>
+              <w:rPr>
+                <w:rFonts w:ascii="Arial Unicode MS" w:hAnsi="Arial Unicode MS"/>
+                <w:sz w:val="18"/>
+              </w:rPr>
+              <w:t>x</w:t>
+            </w:r>
+          </w:p>
+        </w:tc>
+        <w:tc>
+          <w:tcPr>
+            <w:tcW w:type="dxa" w:w="3106"/>
+            <w:tcBorders>
+              <w:top w:val="single" w:sz="8" w:space="0" w:color="000000"/>
+              <w:left w:val="single" w:sz="8" w:space="0" w:color="000000"/>
+              <w:bottom w:val="single" w:sz="8" w:space="0" w:color="000000"/>
+              <w:right w:val="single" w:sz="8" w:space="0" w:color="000000"/>
+            </w:tcBorders>
+          </w:tcPr>
+          <w:p>
+            <w:r>
+              <w:rPr>
+                <w:rFonts w:ascii="Arial Unicode MS" w:hAnsi="Arial Unicode MS"/>
+                <w:sz w:val="18"/>
+              </w:rPr>
+              <w:t>후진</w:t>
+            </w:r>
+          </w:p>
+        </w:tc>
+        <w:tc>
+          <w:tcPr>
+            <w:tcW w:type="dxa" w:w="3106"/>
+            <w:tcBorders>
+              <w:top w:val="single" w:sz="8" w:space="0" w:color="000000"/>
+              <w:left w:val="single" w:sz="8" w:space="0" w:color="000000"/>
+              <w:bottom w:val="single" w:sz="8" w:space="0" w:color="000000"/>
+              <w:right w:val="single" w:sz="8" w:space="0" w:color="000000"/>
+            </w:tcBorders>
+          </w:tcPr>
+          <w:p>
+            <w:r>
+              <w:rPr>
+                <w:rFonts w:ascii="Arial Unicode MS" w:hAnsi="Arial Unicode MS"/>
+                <w:sz w:val="18"/>
+              </w:rPr>
+              <w:t>현재 설정된 선속도로 뒤쪽 주행</w:t>
+            </w:r>
+          </w:p>
+        </w:tc>
+      </w:tr>
+      <w:tr>
+        <w:tc>
+          <w:tcPr>
+            <w:tcW w:type="dxa" w:w="3106"/>
+            <w:tcBorders>
+              <w:top w:val="single" w:sz="8" w:space="0" w:color="000000"/>
+              <w:left w:val="single" w:sz="8" w:space="0" w:color="000000"/>
+              <w:bottom w:val="single" w:sz="8" w:space="0" w:color="000000"/>
+              <w:right w:val="single" w:sz="8" w:space="0" w:color="000000"/>
+            </w:tcBorders>
+          </w:tcPr>
+          <w:p>
+            <w:r>
+              <w:rPr>
+                <w:rFonts w:ascii="Arial Unicode MS" w:hAnsi="Arial Unicode MS"/>
+                <w:sz w:val="18"/>
+              </w:rPr>
+              <w:t>a</w:t>
+            </w:r>
+          </w:p>
+        </w:tc>
+        <w:tc>
+          <w:tcPr>
+            <w:tcW w:type="dxa" w:w="3106"/>
+            <w:tcBorders>
+              <w:top w:val="single" w:sz="8" w:space="0" w:color="000000"/>
+              <w:left w:val="single" w:sz="8" w:space="0" w:color="000000"/>
+              <w:bottom w:val="single" w:sz="8" w:space="0" w:color="000000"/>
+              <w:right w:val="single" w:sz="8" w:space="0" w:color="000000"/>
+            </w:tcBorders>
+          </w:tcPr>
+          <w:p>
+            <w:r>
+              <w:rPr>
+                <w:rFonts w:ascii="Arial Unicode MS" w:hAnsi="Arial Unicode MS"/>
+                <w:sz w:val="18"/>
+              </w:rPr>
+              <w:t>좌회전</w:t>
+            </w:r>
+          </w:p>
+        </w:tc>
+        <w:tc>
+          <w:tcPr>
+            <w:tcW w:type="dxa" w:w="3106"/>
+            <w:tcBorders>
+              <w:top w:val="single" w:sz="8" w:space="0" w:color="000000"/>
+              <w:left w:val="single" w:sz="8" w:space="0" w:color="000000"/>
+              <w:bottom w:val="single" w:sz="8" w:space="0" w:color="000000"/>
+              <w:right w:val="single" w:sz="8" w:space="0" w:color="000000"/>
+            </w:tcBorders>
+          </w:tcPr>
+          <w:p>
+            <w:r>
+              <w:rPr>
+                <w:rFonts w:ascii="Arial Unicode MS" w:hAnsi="Arial Unicode MS"/>
+                <w:sz w:val="18"/>
+              </w:rPr>
+              <w:t>제자리 반시계방향 회전</w:t>
+            </w:r>
+          </w:p>
+        </w:tc>
+      </w:tr>
+      <w:tr>
+        <w:tc>
+          <w:tcPr>
+            <w:tcW w:type="dxa" w:w="3106"/>
+            <w:tcBorders>
+              <w:top w:val="single" w:sz="8" w:space="0" w:color="000000"/>
+              <w:left w:val="single" w:sz="8" w:space="0" w:color="000000"/>
+              <w:bottom w:val="single" w:sz="8" w:space="0" w:color="000000"/>
+              <w:right w:val="single" w:sz="8" w:space="0" w:color="000000"/>
+            </w:tcBorders>
+          </w:tcPr>
+          <w:p>
+            <w:r>
+              <w:rPr>
+                <w:rFonts w:ascii="Arial Unicode MS" w:hAnsi="Arial Unicode MS"/>
+                <w:sz w:val="18"/>
+              </w:rPr>
+              <w:t>d</w:t>
+            </w:r>
+          </w:p>
+        </w:tc>
+        <w:tc>
+          <w:tcPr>
+            <w:tcW w:type="dxa" w:w="3106"/>
+            <w:tcBorders>
+              <w:top w:val="single" w:sz="8" w:space="0" w:color="000000"/>
+              <w:left w:val="single" w:sz="8" w:space="0" w:color="000000"/>
+              <w:bottom w:val="single" w:sz="8" w:space="0" w:color="000000"/>
+              <w:right w:val="single" w:sz="8" w:space="0" w:color="000000"/>
+            </w:tcBorders>
+          </w:tcPr>
+          <w:p>
+            <w:r>
+              <w:rPr>
+                <w:rFonts w:ascii="Arial Unicode MS" w:hAnsi="Arial Unicode MS"/>
+                <w:sz w:val="18"/>
+              </w:rPr>
+              <w:t>우회전</w:t>
+            </w:r>
+          </w:p>
+        </w:tc>
+        <w:tc>
+          <w:tcPr>
+            <w:tcW w:type="dxa" w:w="3106"/>
+            <w:tcBorders>
+              <w:top w:val="single" w:sz="8" w:space="0" w:color="000000"/>
+              <w:left w:val="single" w:sz="8" w:space="0" w:color="000000"/>
+              <w:bottom w:val="single" w:sz="8" w:space="0" w:color="000000"/>
+              <w:right w:val="single" w:sz="8" w:space="0" w:color="000000"/>
+            </w:tcBorders>
+          </w:tcPr>
+          <w:p>
+            <w:r>
+              <w:rPr>
+                <w:rFonts w:ascii="Arial Unicode MS" w:hAnsi="Arial Unicode MS"/>
+                <w:sz w:val="18"/>
+              </w:rPr>
+              <w:t>제자리 시계방향 회전</w:t>
+            </w:r>
+          </w:p>
+        </w:tc>
+      </w:tr>
+      <w:tr>
+        <w:tc>
+          <w:tcPr>
+            <w:tcW w:type="dxa" w:w="3106"/>
+            <w:tcBorders>
+              <w:top w:val="single" w:sz="8" w:space="0" w:color="000000"/>
+              <w:left w:val="single" w:sz="8" w:space="0" w:color="000000"/>
+              <w:bottom w:val="single" w:sz="8" w:space="0" w:color="000000"/>
+              <w:right w:val="single" w:sz="8" w:space="0" w:color="000000"/>
+            </w:tcBorders>
+          </w:tcPr>
+          <w:p>
+            <w:r>
+              <w:rPr>
+                <w:rFonts w:ascii="Arial Unicode MS" w:hAnsi="Arial Unicode MS"/>
+                <w:sz w:val="18"/>
+              </w:rPr>
+              <w:t>s 또는 Space</w:t>
+            </w:r>
+          </w:p>
+        </w:tc>
+        <w:tc>
+          <w:tcPr>
+            <w:tcW w:type="dxa" w:w="3106"/>
+            <w:tcBorders>
+              <w:top w:val="single" w:sz="8" w:space="0" w:color="000000"/>
+              <w:left w:val="single" w:sz="8" w:space="0" w:color="000000"/>
+              <w:bottom w:val="single" w:sz="8" w:space="0" w:color="000000"/>
+              <w:right w:val="single" w:sz="8" w:space="0" w:color="000000"/>
+            </w:tcBorders>
+          </w:tcPr>
+          <w:p>
+            <w:r>
+              <w:rPr>
+                <w:rFonts w:ascii="Arial Unicode MS" w:hAnsi="Arial Unicode MS"/>
+                <w:sz w:val="18"/>
+              </w:rPr>
+              <w:t>정지</w:t>
+            </w:r>
+          </w:p>
+        </w:tc>
+        <w:tc>
+          <w:tcPr>
+            <w:tcW w:type="dxa" w:w="3106"/>
+            <w:tcBorders>
+              <w:top w:val="single" w:sz="8" w:space="0" w:color="000000"/>
+              <w:left w:val="single" w:sz="8" w:space="0" w:color="000000"/>
+              <w:bottom w:val="single" w:sz="8" w:space="0" w:color="000000"/>
+              <w:right w:val="single" w:sz="8" w:space="0" w:color="000000"/>
+            </w:tcBorders>
+          </w:tcPr>
+          <w:p>
+            <w:r>
+              <w:rPr>
+                <w:rFonts w:ascii="Arial Unicode MS" w:hAnsi="Arial Unicode MS"/>
+                <w:sz w:val="18"/>
+              </w:rPr>
+              <w:t>바퀴 모터 즉각 정지</w:t>
+            </w:r>
+          </w:p>
+        </w:tc>
+      </w:tr>
+      <w:tr>
+        <w:tc>
+          <w:tcPr>
+            <w:tcW w:type="dxa" w:w="3106"/>
+            <w:tcBorders>
+              <w:top w:val="single" w:sz="8" w:space="0" w:color="000000"/>
+              <w:left w:val="single" w:sz="8" w:space="0" w:color="000000"/>
+              <w:bottom w:val="single" w:sz="8" w:space="0" w:color="000000"/>
+              <w:right w:val="single" w:sz="8" w:space="0" w:color="000000"/>
+            </w:tcBorders>
+          </w:tcPr>
+          <w:p>
+            <w:r>
+              <w:rPr>
+                <w:rFonts w:ascii="Arial Unicode MS" w:hAnsi="Arial Unicode MS"/>
+                <w:sz w:val="18"/>
+              </w:rPr>
+              <w:t>e</w:t>
+            </w:r>
+          </w:p>
+        </w:tc>
+        <w:tc>
+          <w:tcPr>
+            <w:tcW w:type="dxa" w:w="3106"/>
+            <w:tcBorders>
+              <w:top w:val="single" w:sz="8" w:space="0" w:color="000000"/>
+              <w:left w:val="single" w:sz="8" w:space="0" w:color="000000"/>
+              <w:bottom w:val="single" w:sz="8" w:space="0" w:color="000000"/>
+              <w:right w:val="single" w:sz="8" w:space="0" w:color="000000"/>
+            </w:tcBorders>
+          </w:tcPr>
+          <w:p>
+            <w:r>
+              <w:rPr>
+                <w:rFonts w:ascii="Arial Unicode MS" w:hAnsi="Arial Unicode MS"/>
+                <w:sz w:val="18"/>
+              </w:rPr>
+              <w:t>속도 증가</w:t>
+            </w:r>
+          </w:p>
+        </w:tc>
+        <w:tc>
+          <w:tcPr>
+            <w:tcW w:type="dxa" w:w="3106"/>
+            <w:tcBorders>
+              <w:top w:val="single" w:sz="8" w:space="0" w:color="000000"/>
+              <w:left w:val="single" w:sz="8" w:space="0" w:color="000000"/>
+              <w:bottom w:val="single" w:sz="8" w:space="0" w:color="000000"/>
+              <w:right w:val="single" w:sz="8" w:space="0" w:color="000000"/>
+            </w:tcBorders>
+          </w:tcPr>
+          <w:p>
+            <w:r>
+              <w:rPr>
+                <w:rFonts w:ascii="Arial Unicode MS" w:hAnsi="Arial Unicode MS"/>
+                <w:sz w:val="18"/>
+              </w:rPr>
+              <w:t>선속도 0.02 m/s 실시간 증가</w:t>
+            </w:r>
+          </w:p>
+        </w:tc>
+      </w:tr>
+      <w:tr>
+        <w:tc>
+          <w:tcPr>
+            <w:tcW w:type="dxa" w:w="3106"/>
+            <w:tcBorders>
+              <w:top w:val="single" w:sz="8" w:space="0" w:color="000000"/>
+              <w:left w:val="single" w:sz="8" w:space="0" w:color="000000"/>
+              <w:bottom w:val="single" w:sz="8" w:space="0" w:color="000000"/>
+              <w:right w:val="single" w:sz="8" w:space="0" w:color="000000"/>
+            </w:tcBorders>
+          </w:tcPr>
+          <w:p>
+            <w:r>
+              <w:rPr>
+                <w:rFonts w:ascii="Arial Unicode MS" w:hAnsi="Arial Unicode MS"/>
+                <w:sz w:val="18"/>
+              </w:rPr>
+              <w:t>c</w:t>
+            </w:r>
+          </w:p>
+        </w:tc>
+        <w:tc>
+          <w:tcPr>
+            <w:tcW w:type="dxa" w:w="3106"/>
+            <w:tcBorders>
+              <w:top w:val="single" w:sz="8" w:space="0" w:color="000000"/>
+              <w:left w:val="single" w:sz="8" w:space="0" w:color="000000"/>
+              <w:bottom w:val="single" w:sz="8" w:space="0" w:color="000000"/>
+              <w:right w:val="single" w:sz="8" w:space="0" w:color="000000"/>
+            </w:tcBorders>
+          </w:tcPr>
+          <w:p>
+            <w:r>
+              <w:rPr>
+                <w:rFonts w:ascii="Arial Unicode MS" w:hAnsi="Arial Unicode MS"/>
+                <w:sz w:val="18"/>
+              </w:rPr>
+              <w:t>속도 감소</w:t>
+            </w:r>
+          </w:p>
+        </w:tc>
+        <w:tc>
+          <w:tcPr>
+            <w:tcW w:type="dxa" w:w="3106"/>
+            <w:tcBorders>
+              <w:top w:val="single" w:sz="8" w:space="0" w:color="000000"/>
+              <w:left w:val="single" w:sz="8" w:space="0" w:color="000000"/>
+              <w:bottom w:val="single" w:sz="8" w:space="0" w:color="000000"/>
+              <w:right w:val="single" w:sz="8" w:space="0" w:color="000000"/>
+            </w:tcBorders>
+          </w:tcPr>
+          <w:p>
+            <w:r>
+              <w:rPr>
+                <w:rFonts w:ascii="Arial Unicode MS" w:hAnsi="Arial Unicode MS"/>
+                <w:sz w:val="18"/>
+              </w:rPr>
+              <w:t>선속도 0.02 m/s 실시간 감소</w:t>
+            </w:r>
+          </w:p>
+        </w:tc>
+      </w:tr>
+      <w:tr>
+        <w:tc>
+          <w:tcPr>
+            <w:tcW w:type="dxa" w:w="3106"/>
+            <w:tcBorders>
+              <w:top w:val="single" w:sz="8" w:space="0" w:color="000000"/>
+              <w:left w:val="single" w:sz="8" w:space="0" w:color="000000"/>
+              <w:bottom w:val="single" w:sz="8" w:space="0" w:color="000000"/>
+              <w:right w:val="single" w:sz="8" w:space="0" w:color="000000"/>
+            </w:tcBorders>
+          </w:tcPr>
+          <w:p>
+            <w:r>
+              <w:rPr>
+                <w:rFonts w:ascii="Arial Unicode MS" w:hAnsi="Arial Unicode MS"/>
+                <w:sz w:val="18"/>
+              </w:rPr>
+              <w:t>q</w:t>
+            </w:r>
+          </w:p>
+        </w:tc>
+        <w:tc>
+          <w:tcPr>
+            <w:tcW w:type="dxa" w:w="3106"/>
+            <w:tcBorders>
+              <w:top w:val="single" w:sz="8" w:space="0" w:color="000000"/>
+              <w:left w:val="single" w:sz="8" w:space="0" w:color="000000"/>
+              <w:bottom w:val="single" w:sz="8" w:space="0" w:color="000000"/>
+              <w:right w:val="single" w:sz="8" w:space="0" w:color="000000"/>
+            </w:tcBorders>
+          </w:tcPr>
+          <w:p>
+            <w:r>
+              <w:rPr>
+                <w:rFonts w:ascii="Arial Unicode MS" w:hAnsi="Arial Unicode MS"/>
+                <w:sz w:val="18"/>
+              </w:rPr>
+              <w:t>종료</w:t>
+            </w:r>
+          </w:p>
+        </w:tc>
+        <w:tc>
+          <w:tcPr>
+            <w:tcW w:type="dxa" w:w="3106"/>
+            <w:tcBorders>
+              <w:top w:val="single" w:sz="8" w:space="0" w:color="000000"/>
+              <w:left w:val="single" w:sz="8" w:space="0" w:color="000000"/>
+              <w:bottom w:val="single" w:sz="8" w:space="0" w:color="000000"/>
+              <w:right w:val="single" w:sz="8" w:space="0" w:color="000000"/>
+            </w:tcBorders>
+          </w:tcPr>
+          <w:p>
+            <w:r>
+              <w:rPr>
+                <w:rFonts w:ascii="Arial Unicode MS" w:hAnsi="Arial Unicode MS"/>
+                <w:sz w:val="18"/>
+              </w:rPr>
+              <w:t>로봇 정지 후 콘솔 프로그램 종료</w:t>
+            </w:r>
+          </w:p>
+        </w:tc>
+      </w:tr>
+    </w:tbl>
     <w:sectPr>
-      <w:pgSz w:w="12240" w:h="15840"/>
-      <w:pgMar w:top="1152" w:right="1296" w:bottom="1152" w:left="1296" w:header="720" w:footer="720" w:gutter="0"/>
+      <w:pgSz w:w="11909" w:h="16834"/>
+      <w:pgMar w:top="1296" w:right="1296" w:bottom="1296" w:left="1296" w:header="720" w:footer="720" w:gutter="0"/>
       <w:cols w:space="720"/>
       <w:docGrid w:linePitch="360"/>
     </w:sectPr>
@@ -2289,11 +2715,6 @@
     <w:name w:val="Normal"/>
     <w:qFormat/>
     <w:rsid w:val="00FC693F"/>
-    <w:rPr>
-      <w:rFonts w:ascii="Malgun Gothic" w:hAnsi="Malgun Gothic"/>
-      <w:color w:val="1F2328"/>
-      <w:sz w:val="20"/>
-    </w:rPr>
   </w:style>
   <w:style w:type="paragraph" w:styleId="Header">
     <w:name w:val="header"/>

</xml_diff>

<commit_message>
docs: add dedicated package build (catkin_make) and setup verification step
</commit_message>
<xml_diff>
--- a/STUDENT_GUIDE.docx
+++ b/STUDENT_GUIDE.docx
@@ -1244,7 +1244,265 @@
           <w:color w:val="000000"/>
           <w:sz w:val="26"/>
         </w:rPr>
-        <w:t>6. 네트워크 환경 설정 (노트북과 로봇 무선 연결)</w:t>
+        <w:t>6. 패키지 빌드 및 환경변수 등록 (Build)</w:t>
+      </w:r>
+    </w:p>
+    <w:p>
+      <w:pPr>
+        <w:spacing w:before="120" w:after="40"/>
+        <w:ind w:left="216"/>
+      </w:pPr>
+      <w:r>
+        <w:rPr>
+          <w:rFonts w:ascii="Arial Unicode MS" w:hAnsi="Arial Unicode MS"/>
+          <w:b/>
+          <w:color w:val="000000"/>
+          <w:sz w:val="21"/>
+        </w:rPr>
+        <w:t>1) 워크스페이스로 이동하여 빌드 수행 (catkin_make)</w:t>
+      </w:r>
+    </w:p>
+    <w:p>
+      <w:pPr>
+        <w:spacing w:before="20" w:after="40"/>
+        <w:ind w:left="432"/>
+      </w:pPr>
+      <w:r>
+        <w:rPr>
+          <w:rFonts w:ascii="Arial Unicode MS" w:hAnsi="Arial Unicode MS"/>
+          <w:color w:val="000000"/>
+          <w:sz w:val="19"/>
+        </w:rPr>
+        <w:t>패키지 생성이 완료되면 반드시 catkin 워크스페이스 루트에서 빌드를 수행해야 ROS가 패키지를 인식합니다:</w:t>
+      </w:r>
+    </w:p>
+    <w:tbl>
+      <w:tblPr>
+        <w:tblW w:type="auto" w:w="0"/>
+        <w:jc w:val="center"/>
+        <w:tblLook w:firstColumn="1" w:firstRow="1" w:lastColumn="0" w:lastRow="0" w:noHBand="0" w:noVBand="1" w:val="04A0"/>
+      </w:tblPr>
+      <w:tblGrid>
+        <w:gridCol w:w="9317"/>
+      </w:tblGrid>
+      <w:tr>
+        <w:tc>
+          <w:tcPr>
+            <w:tcW w:type="dxa" w:w="9072"/>
+            <w:tcBorders>
+              <w:top w:val="single" w:sz="8" w:space="0" w:color="000000"/>
+              <w:left w:val="single" w:sz="8" w:space="0" w:color="000000"/>
+              <w:bottom w:val="single" w:sz="8" w:space="0" w:color="000000"/>
+              <w:right w:val="single" w:sz="8" w:space="0" w:color="000000"/>
+            </w:tcBorders>
+            <w:tcMar>
+              <w:top w:w="120" w:type="dxa"/>
+              <w:bottom w:w="120" w:type="dxa"/>
+              <w:left w:w="160" w:type="dxa"/>
+              <w:right w:w="160" w:type="dxa"/>
+            </w:tcMar>
+          </w:tcPr>
+          <w:p>
+            <w:pPr>
+              <w:spacing w:before="0" w:after="0" w:line="276" w:lineRule="auto"/>
+            </w:pPr>
+            <w:r>
+              <w:rPr>
+                <w:rFonts w:ascii="Consolas" w:hAnsi="Consolas"/>
+                <w:color w:val="000000"/>
+                <w:sz w:val="17"/>
+              </w:rPr>
+              <w:t>cd ~/turtle_ws</w:t>
+              <w:br/>
+              <w:t>catkin_make</w:t>
+            </w:r>
+          </w:p>
+        </w:tc>
+      </w:tr>
+    </w:tbl>
+    <w:p>
+      <w:pPr>
+        <w:spacing w:before="0" w:after="80"/>
+      </w:pPr>
+    </w:p>
+    <w:p>
+      <w:pPr>
+        <w:spacing w:before="120" w:after="40"/>
+        <w:ind w:left="216"/>
+      </w:pPr>
+      <w:r>
+        <w:rPr>
+          <w:rFonts w:ascii="Arial Unicode MS" w:hAnsi="Arial Unicode MS"/>
+          <w:b/>
+          <w:color w:val="000000"/>
+          <w:sz w:val="21"/>
+        </w:rPr>
+        <w:t>2) 빌드 환경변수 적용 (source)</w:t>
+      </w:r>
+    </w:p>
+    <w:p>
+      <w:pPr>
+        <w:spacing w:before="20" w:after="40"/>
+        <w:ind w:left="432"/>
+      </w:pPr>
+      <w:r>
+        <w:rPr>
+          <w:rFonts w:ascii="Arial Unicode MS" w:hAnsi="Arial Unicode MS"/>
+          <w:color w:val="000000"/>
+          <w:sz w:val="19"/>
+        </w:rPr>
+        <w:t>빌드 후 생성된 실행 환경을 현재 터미널에 반영합니다:</w:t>
+      </w:r>
+    </w:p>
+    <w:tbl>
+      <w:tblPr>
+        <w:tblW w:type="auto" w:w="0"/>
+        <w:jc w:val="center"/>
+        <w:tblLook w:firstColumn="1" w:firstRow="1" w:lastColumn="0" w:lastRow="0" w:noHBand="0" w:noVBand="1" w:val="04A0"/>
+      </w:tblPr>
+      <w:tblGrid>
+        <w:gridCol w:w="9317"/>
+      </w:tblGrid>
+      <w:tr>
+        <w:tc>
+          <w:tcPr>
+            <w:tcW w:type="dxa" w:w="9072"/>
+            <w:tcBorders>
+              <w:top w:val="single" w:sz="8" w:space="0" w:color="000000"/>
+              <w:left w:val="single" w:sz="8" w:space="0" w:color="000000"/>
+              <w:bottom w:val="single" w:sz="8" w:space="0" w:color="000000"/>
+              <w:right w:val="single" w:sz="8" w:space="0" w:color="000000"/>
+            </w:tcBorders>
+            <w:tcMar>
+              <w:top w:w="120" w:type="dxa"/>
+              <w:bottom w:w="120" w:type="dxa"/>
+              <w:left w:w="160" w:type="dxa"/>
+              <w:right w:w="160" w:type="dxa"/>
+            </w:tcMar>
+          </w:tcPr>
+          <w:p>
+            <w:pPr>
+              <w:spacing w:before="0" w:after="0" w:line="276" w:lineRule="auto"/>
+            </w:pPr>
+            <w:r>
+              <w:rPr>
+                <w:rFonts w:ascii="Consolas" w:hAnsi="Consolas"/>
+                <w:color w:val="000000"/>
+                <w:sz w:val="17"/>
+              </w:rPr>
+              <w:t>source devel/setup.bash</w:t>
+            </w:r>
+          </w:p>
+        </w:tc>
+      </w:tr>
+    </w:tbl>
+    <w:p>
+      <w:pPr>
+        <w:spacing w:before="0" w:after="80"/>
+      </w:pPr>
+    </w:p>
+    <w:p>
+      <w:pPr>
+        <w:spacing w:before="120" w:after="40"/>
+        <w:ind w:left="216"/>
+      </w:pPr>
+      <w:r>
+        <w:rPr>
+          <w:rFonts w:ascii="Arial Unicode MS" w:hAnsi="Arial Unicode MS"/>
+          <w:b/>
+          <w:color w:val="000000"/>
+          <w:sz w:val="21"/>
+        </w:rPr>
+        <w:t>3) 패키지 인식 확인 (rospack)</w:t>
+      </w:r>
+    </w:p>
+    <w:p>
+      <w:pPr>
+        <w:spacing w:before="20" w:after="40"/>
+        <w:ind w:left="432"/>
+      </w:pPr>
+      <w:r>
+        <w:rPr>
+          <w:rFonts w:ascii="Arial Unicode MS" w:hAnsi="Arial Unicode MS"/>
+          <w:color w:val="000000"/>
+          <w:sz w:val="19"/>
+        </w:rPr>
+        <w:t>ROS 패키지 시스템에 srobot 패키지가 정상적으로 등록되었는지 확인합니다:</w:t>
+      </w:r>
+    </w:p>
+    <w:tbl>
+      <w:tblPr>
+        <w:tblW w:type="auto" w:w="0"/>
+        <w:jc w:val="center"/>
+        <w:tblLook w:firstColumn="1" w:firstRow="1" w:lastColumn="0" w:lastRow="0" w:noHBand="0" w:noVBand="1" w:val="04A0"/>
+      </w:tblPr>
+      <w:tblGrid>
+        <w:gridCol w:w="9317"/>
+      </w:tblGrid>
+      <w:tr>
+        <w:tc>
+          <w:tcPr>
+            <w:tcW w:type="dxa" w:w="9072"/>
+            <w:tcBorders>
+              <w:top w:val="single" w:sz="8" w:space="0" w:color="000000"/>
+              <w:left w:val="single" w:sz="8" w:space="0" w:color="000000"/>
+              <w:bottom w:val="single" w:sz="8" w:space="0" w:color="000000"/>
+              <w:right w:val="single" w:sz="8" w:space="0" w:color="000000"/>
+            </w:tcBorders>
+            <w:tcMar>
+              <w:top w:w="120" w:type="dxa"/>
+              <w:bottom w:w="120" w:type="dxa"/>
+              <w:left w:w="160" w:type="dxa"/>
+              <w:right w:w="160" w:type="dxa"/>
+            </w:tcMar>
+          </w:tcPr>
+          <w:p>
+            <w:pPr>
+              <w:spacing w:before="0" w:after="0" w:line="276" w:lineRule="auto"/>
+            </w:pPr>
+            <w:r>
+              <w:rPr>
+                <w:rFonts w:ascii="Consolas" w:hAnsi="Consolas"/>
+                <w:color w:val="000000"/>
+                <w:sz w:val="17"/>
+              </w:rPr>
+              <w:t>rospack find srobot</w:t>
+            </w:r>
+          </w:p>
+        </w:tc>
+      </w:tr>
+    </w:tbl>
+    <w:p>
+      <w:pPr>
+        <w:spacing w:before="0" w:after="80"/>
+      </w:pPr>
+    </w:p>
+    <w:p>
+      <w:pPr>
+        <w:spacing w:before="20" w:after="40"/>
+        <w:ind w:left="432"/>
+      </w:pPr>
+      <w:r>
+        <w:rPr>
+          <w:rFonts w:ascii="Arial Unicode MS" w:hAnsi="Arial Unicode MS"/>
+          <w:color w:val="000000"/>
+          <w:sz w:val="19"/>
+        </w:rPr>
+        <w:t>* 출력 결과로 '/home/.../turtle_ws/src/srobot' 경로가 나타나면 정상적으로 빌드 및 등록이 완료된 것입니다.</w:t>
+      </w:r>
+    </w:p>
+    <w:p>
+      <w:pPr>
+        <w:spacing w:before="280" w:after="80"/>
+      </w:pPr>
+      <w:r>
+        <w:rPr>
+          <w:rFonts w:ascii="Arial Unicode MS" w:hAnsi="Arial Unicode MS"/>
+          <w:b/>
+          <w:color w:val="000000"/>
+          <w:sz w:val="26"/>
+        </w:rPr>
+        <w:t>7. 네트워크 환경 설정 (노트북과 로봇 무선 연결)</w:t>
       </w:r>
     </w:p>
     <w:p>
@@ -1505,7 +1763,7 @@
           <w:color w:val="000000"/>
           <w:sz w:val="26"/>
         </w:rPr>
-        <w:t>7. 로봇 주행 실습</w:t>
+        <w:t>8. 로봇 주행 실습</w:t>
       </w:r>
     </w:p>
     <w:p>
@@ -1520,7 +1778,7 @@
           <w:color w:val="000000"/>
           <w:sz w:val="21"/>
         </w:rPr>
-        <w:t>1) 워크스페이스 빌드하기</w:t>
+        <w:t>1) 로봇에서 모터 노드 실행</w:t>
       </w:r>
     </w:p>
     <w:p>
@@ -1534,87 +1792,7 @@
           <w:color w:val="000000"/>
           <w:sz w:val="19"/>
         </w:rPr>
-        <w:t>노트북과 로봇의 워크스페이스에서 빌드를 수행합니다:</w:t>
-      </w:r>
-    </w:p>
-    <w:tbl>
-      <w:tblPr>
-        <w:tblW w:type="auto" w:w="0"/>
-        <w:jc w:val="center"/>
-        <w:tblLook w:firstColumn="1" w:firstRow="1" w:lastColumn="0" w:lastRow="0" w:noHBand="0" w:noVBand="1" w:val="04A0"/>
-      </w:tblPr>
-      <w:tblGrid>
-        <w:gridCol w:w="9317"/>
-      </w:tblGrid>
-      <w:tr>
-        <w:tc>
-          <w:tcPr>
-            <w:tcW w:type="dxa" w:w="9072"/>
-            <w:tcBorders>
-              <w:top w:val="single" w:sz="8" w:space="0" w:color="000000"/>
-              <w:left w:val="single" w:sz="8" w:space="0" w:color="000000"/>
-              <w:bottom w:val="single" w:sz="8" w:space="0" w:color="000000"/>
-              <w:right w:val="single" w:sz="8" w:space="0" w:color="000000"/>
-            </w:tcBorders>
-            <w:tcMar>
-              <w:top w:w="120" w:type="dxa"/>
-              <w:bottom w:w="120" w:type="dxa"/>
-              <w:left w:w="160" w:type="dxa"/>
-              <w:right w:w="160" w:type="dxa"/>
-            </w:tcMar>
-          </w:tcPr>
-          <w:p>
-            <w:pPr>
-              <w:spacing w:before="0" w:after="0" w:line="276" w:lineRule="auto"/>
-            </w:pPr>
-            <w:r>
-              <w:rPr>
-                <w:rFonts w:ascii="Consolas" w:hAnsi="Consolas"/>
-                <w:color w:val="000000"/>
-                <w:sz w:val="17"/>
-              </w:rPr>
-              <w:t>cd ~/turtle_ws</w:t>
-              <w:br/>
-              <w:t>catkin_make</w:t>
-              <w:br/>
-              <w:t>source devel/setup.bash</w:t>
-            </w:r>
-          </w:p>
-        </w:tc>
-      </w:tr>
-    </w:tbl>
-    <w:p>
-      <w:pPr>
-        <w:spacing w:before="0" w:after="80"/>
-      </w:pPr>
-    </w:p>
-    <w:p>
-      <w:pPr>
-        <w:spacing w:before="120" w:after="40"/>
-        <w:ind w:left="216"/>
-      </w:pPr>
-      <w:r>
-        <w:rPr>
-          <w:rFonts w:ascii="Arial Unicode MS" w:hAnsi="Arial Unicode MS"/>
-          <w:b/>
-          <w:color w:val="000000"/>
-          <w:sz w:val="21"/>
-        </w:rPr>
-        <w:t>2) 로봇에서 모터 노드 실행</w:t>
-      </w:r>
-    </w:p>
-    <w:p>
-      <w:pPr>
-        <w:spacing w:before="20" w:after="40"/>
-        <w:ind w:left="432"/>
-      </w:pPr>
-      <w:r>
-        <w:rPr>
-          <w:rFonts w:ascii="Arial Unicode MS" w:hAnsi="Arial Unicode MS"/>
-          <w:color w:val="000000"/>
-          <w:sz w:val="19"/>
-        </w:rPr>
-        <w:t>로봇에 SSH 접속하거나 로봇 본체에서 아래 명령을 실행합니다:</w:t>
+        <w:t>로봇에 SSH 접속하거나 로봇 본체 터미널에서 아래 명령을 실행합니다:</w:t>
       </w:r>
     </w:p>
     <w:tbl>
@@ -1676,7 +1854,7 @@
           <w:color w:val="000000"/>
           <w:sz w:val="21"/>
         </w:rPr>
-        <w:t>3) 노트북에서 조종 콘솔 실행</w:t>
+        <w:t>2) 노트북에서 조종 콘솔 실행</w:t>
       </w:r>
     </w:p>
     <w:p>
@@ -1752,7 +1930,7 @@
           <w:color w:val="000000"/>
           <w:sz w:val="21"/>
         </w:rPr>
-        <w:t>4) 키보드 조종 가이드</w:t>
+        <w:t>3) 키보드 조종 가이드</w:t>
       </w:r>
     </w:p>
     <w:p>

</xml_diff>

<commit_message>
docs: clarify robot platform as TurtleBot throughout documentation
</commit_message>
<xml_diff>
--- a/STUDENT_GUIDE.docx
+++ b/STUDENT_GUIDE.docx
@@ -13,7 +13,7 @@
           <w:color w:val="000000"/>
           <w:sz w:val="36"/>
         </w:rPr>
-        <w:t>ROS 1 Noetic 로봇 원격 조종 패키지 제작 실습</w:t>
+        <w:t>ROS 1 Noetic 터틀봇 원격 조종 패키지 제작 실습</w:t>
       </w:r>
     </w:p>
     <w:p>
@@ -70,7 +70,7 @@
           <w:color w:val="000000"/>
           <w:sz w:val="19"/>
         </w:rPr>
-        <w:t>- 로봇 바퀴 모터 제어 표준 메시지인 geometry_msgs/Twist의 구조와 동작 방식을 이해합니다.</w:t>
+        <w:t>- 터틀봇 바퀴 모터 제어 표준 메시지인 geometry_msgs/Twist의 구조와 동작 방식을 이해합니다.</w:t>
       </w:r>
     </w:p>
     <w:p>
@@ -84,7 +84,7 @@
           <w:color w:val="000000"/>
           <w:sz w:val="19"/>
         </w:rPr>
-        <w:t>- 노트북 키보드 입력을 통해 원격 로봇을 실시간 조종하는 srobot 패키지를 완성합니다.</w:t>
+        <w:t>- 노트북 키보드 입력을 통해 원격 터틀봇을 실시간 조종하는 srobot 패키지를 완성합니다.</w:t>
       </w:r>
     </w:p>
     <w:p>
@@ -127,7 +127,7 @@
           <w:color w:val="000000"/>
           <w:sz w:val="19"/>
         </w:rPr>
-        <w:t>- 무선 네트워크 (Wi-Fi) : 노트북과 로봇 간 ROS 멀티 마신 무선 통신 연결</w:t>
+        <w:t>- 무선 네트워크 (Wi-Fi) : 노트북과 터틀봇 간 ROS 멀티 마신 무선 통신 연결</w:t>
       </w:r>
     </w:p>
     <w:p>
@@ -141,7 +141,7 @@
           <w:color w:val="000000"/>
           <w:sz w:val="19"/>
         </w:rPr>
-        <w:t>- 로봇 (motor_driver.py) : /srobot/key_cmd 토픽 수신 후 /cmd_vel 토픽(Twist) 발행</w:t>
+        <w:t>- 터틀봇 (motor_driver.py) : /srobot/key_cmd 토픽 수신 후 /cmd_vel 토픽(Twist) 발행</w:t>
       </w:r>
     </w:p>
     <w:p>
@@ -155,7 +155,7 @@
           <w:color w:val="000000"/>
           <w:sz w:val="19"/>
         </w:rPr>
-        <w:t>- OpenCR 보드 (rosserial) : /cmd_vel 속도 지휘값을 받아 좌/우 다이나믹셀 모터 구동</w:t>
+        <w:t>- OpenCR 보드 (rosserial) : /cmd_vel 속도 지휘값을 받아 터틀봇 좌/우 다이나믹셀 모터 구동</w:t>
       </w:r>
     </w:p>
     <w:p>
@@ -199,7 +199,7 @@
           <w:color w:val="000000"/>
           <w:sz w:val="21"/>
         </w:rPr>
-        <w:t>2) 의존성 패키지 : rospy, std_msgs, geometry_msgs, rosserial_python</w:t>
+        <w:t>2) 대상 로봇 : 터틀봇 (TurtleBot3 Burger 호환, OpenCR + 다이나믹셀 XL430)</w:t>
       </w:r>
     </w:p>
     <w:p>
@@ -214,7 +214,22 @@
           <w:color w:val="000000"/>
           <w:sz w:val="21"/>
         </w:rPr>
-        <w:t>3) 로봇 측 필수 패키지 설치 및 권한 설정</w:t>
+        <w:t>3) 의존성 패키지 : rospy, std_msgs, geometry_msgs, rosserial_python</w:t>
+      </w:r>
+    </w:p>
+    <w:p>
+      <w:pPr>
+        <w:spacing w:before="120" w:after="40"/>
+        <w:ind w:left="216"/>
+      </w:pPr>
+      <w:r>
+        <w:rPr>
+          <w:rFonts w:ascii="Arial Unicode MS" w:hAnsi="Arial Unicode MS"/>
+          <w:b/>
+          <w:color w:val="000000"/>
+          <w:sz w:val="21"/>
+        </w:rPr>
+        <w:t>4) 터틀봇 측 필수 패키지 설치 및 권한 설정</w:t>
       </w:r>
     </w:p>
     <w:p>
@@ -228,7 +243,7 @@
           <w:color w:val="000000"/>
           <w:sz w:val="19"/>
         </w:rPr>
-        <w:t>로봇(라즈베리파이) 터미널에서 OpenCR 시리얼 통신 패키지를 설치하고 권한을 부여합니다:</w:t>
+        <w:t>터틀봇(라즈베리파이) 터미널에서 OpenCR 시리얼 통신 패키지를 설치하고 권한을 부여합니다:</w:t>
       </w:r>
     </w:p>
     <w:tbl>
@@ -294,7 +309,7 @@
           <w:color w:val="000000"/>
           <w:sz w:val="21"/>
         </w:rPr>
-        <w:t>4) 깃허브에서 패키지 다운로드 (Git Clone)</w:t>
+        <w:t>5) 깃허브에서 패키지 다운로드 (Git Clone)</w:t>
       </w:r>
     </w:p>
     <w:p>
@@ -372,7 +387,7 @@
           <w:color w:val="000000"/>
           <w:sz w:val="21"/>
         </w:rPr>
-        <w:t>5) 직접 패키지 생성하기 (처음부터 직접 만들 경우)</w:t>
+        <w:t>6) 직접 패키지 생성하기 (처음부터 직접 만들 경우)</w:t>
       </w:r>
     </w:p>
     <w:p>
@@ -497,7 +512,7 @@
           <w:color w:val="000000"/>
           <w:sz w:val="19"/>
         </w:rPr>
-        <w:t>노트북에서 엔터(Enter) 없이 키보드 입력을 즉시 감지하여 로봇으로 전송하는 노드입니다:</w:t>
+        <w:t>노트북에서 엔터(Enter) 없이 키보드 입력을 즉시 감지하여 터틀봇으로 전송하는 노드입니다:</w:t>
       </w:r>
     </w:p>
     <w:tbl>
@@ -732,7 +747,7 @@
           <w:color w:val="000000"/>
           <w:sz w:val="26"/>
         </w:rPr>
-        <w:t>4. 로봇 모터 드라이버 노드 작성 (motor_driver.py)</w:t>
+        <w:t>4. 터틀봇 모터 드라이버 노드 작성 (motor_driver.py)</w:t>
       </w:r>
     </w:p>
     <w:p>
@@ -776,7 +791,7 @@
           <w:color w:val="000000"/>
           <w:sz w:val="19"/>
         </w:rPr>
-        <w:t>키 입력을 수신하여 다이나믹셀 모터 구동용 Twist 속도로 변환해 /cmd_vel로 발행하는 노드입니다:</w:t>
+        <w:t>키 입력을 수신하여 터틀봇 다이나믹셀 모터 구동용 Twist 속도로 변환해 /cmd_vel로 발행하는 노드입니다:</w:t>
       </w:r>
     </w:p>
     <w:tbl>
@@ -1076,7 +1091,7 @@
           <w:color w:val="000000"/>
           <w:sz w:val="21"/>
         </w:rPr>
-        <w:t>1) 로봇용 런치 파일 : launch/robot.launch</w:t>
+        <w:t>1) 터틀봇용 런치 파일 : launch/robot.launch</w:t>
       </w:r>
     </w:p>
     <w:p>
@@ -1502,7 +1517,7 @@
           <w:color w:val="000000"/>
           <w:sz w:val="26"/>
         </w:rPr>
-        <w:t>7. 네트워크 환경 설정 (노트북과 로봇 무선 연결)</w:t>
+        <w:t>7. 네트워크 환경 설정 (노트북과 터틀봇 무선 연결)</w:t>
       </w:r>
     </w:p>
     <w:p>
@@ -1531,7 +1546,7 @@
           <w:color w:val="000000"/>
           <w:sz w:val="19"/>
         </w:rPr>
-        <w:t>노트북과 로봇 각각 터미널에서 자신의 Wi-Fi IP 주소를 확인합니다:</w:t>
+        <w:t>노트북과 터틀봇 각각 터미널에서 자신의 Wi-Fi IP 주소를 확인합니다:</w:t>
       </w:r>
     </w:p>
     <w:tbl>
@@ -1607,7 +1622,7 @@
           <w:color w:val="000000"/>
           <w:sz w:val="19"/>
         </w:rPr>
-        <w:t>- ROS_MASTER_URI : roscore가 실행 중인 로봇의 IP 주소 (양쪽 모두 동일하게 입력)</w:t>
+        <w:t>- ROS_MASTER_URI : roscore가 실행 중인 터틀봇의 IP 주소 (양쪽 모두 동일하게 입력)</w:t>
       </w:r>
     </w:p>
     <w:p>
@@ -1636,7 +1651,7 @@
           <w:color w:val="000000"/>
           <w:sz w:val="21"/>
         </w:rPr>
-        <w:t>3) 로봇 환경변수 등록</w:t>
+        <w:t>3) 터틀봇 환경변수 등록</w:t>
       </w:r>
     </w:p>
     <w:tbl>
@@ -1675,9 +1690,9 @@
                 <w:color w:val="000000"/>
                 <w:sz w:val="17"/>
               </w:rPr>
-              <w:t>export ROS_MASTER_URI=http://&lt;로봇IP&gt;:11311</w:t>
+              <w:t>export ROS_MASTER_URI=http://&lt;터틀봇IP&gt;:11311</w:t>
               <w:br/>
-              <w:t>export ROS_IP=&lt;로봇IP&gt;</w:t>
+              <w:t>export ROS_IP=&lt;터틀봇IP&gt;</w:t>
             </w:r>
           </w:p>
         </w:tc>
@@ -1739,7 +1754,7 @@
                 <w:color w:val="000000"/>
                 <w:sz w:val="17"/>
               </w:rPr>
-              <w:t>export ROS_MASTER_URI=http://&lt;로봇IP&gt;:11311</w:t>
+              <w:t>export ROS_MASTER_URI=http://&lt;터틀봇IP&gt;:11311</w:t>
               <w:br/>
               <w:t>export ROS_IP=&lt;노트북IP&gt;</w:t>
             </w:r>
@@ -1763,7 +1778,7 @@
           <w:color w:val="000000"/>
           <w:sz w:val="26"/>
         </w:rPr>
-        <w:t>8. 로봇 주행 실습</w:t>
+        <w:t>8. 터틀봇 주행 실습</w:t>
       </w:r>
     </w:p>
     <w:p>
@@ -1778,7 +1793,7 @@
           <w:color w:val="000000"/>
           <w:sz w:val="21"/>
         </w:rPr>
-        <w:t>1) 로봇에서 모터 노드 실행</w:t>
+        <w:t>1) 터틀봇에서 모터 노드 실행</w:t>
       </w:r>
     </w:p>
     <w:p>
@@ -1792,7 +1807,7 @@
           <w:color w:val="000000"/>
           <w:sz w:val="19"/>
         </w:rPr>
-        <w:t>로봇에 SSH 접속하거나 로봇 본체 터미널에서 아래 명령을 실행합니다:</w:t>
+        <w:t>터틀봇에 SSH 접속하거나 본체 터미널에서 아래 명령을 실행합니다:</w:t>
       </w:r>
     </w:p>
     <w:tbl>
@@ -1944,7 +1959,7 @@
           <w:color w:val="000000"/>
           <w:sz w:val="19"/>
         </w:rPr>
-        <w:t>콘솔 창에 키를 누르면 로봇이 엔터 없이 즉각 반응하여 주행합니다:</w:t>
+        <w:t>콘솔 창에 키를 누르면 터틀봇이 엔터 없이 즉각 반응하여 주행합니다:</w:t>
       </w:r>
     </w:p>
     <w:tbl>

</xml_diff>